<commit_message>
Report: closing statements per chapter; fold full deck detail into text
</commit_message>
<xml_diff>
--- a/reports/Network_Anomaly_Detection_Report.docx
+++ b/reports/Network_Anomaly_Detection_Report.docx
@@ -163,7 +163,7 @@
           <w:sz w:val="20"/>
           <w:szCs w:val="20"/>
         </w:rPr>
-        <w:t xml:space="preserve">	4</w:t>
+        <w:t xml:space="preserve">	5</w:t>
       </w:r>
     </w:p>
     <w:p>
@@ -191,7 +191,7 @@
           <w:sz w:val="19"/>
           <w:szCs w:val="19"/>
         </w:rPr>
-        <w:t xml:space="preserve">	4</w:t>
+        <w:t xml:space="preserve">	5</w:t>
       </w:r>
     </w:p>
     <w:p>
@@ -219,7 +219,7 @@
           <w:sz w:val="19"/>
           <w:szCs w:val="19"/>
         </w:rPr>
-        <w:t xml:space="preserve">	4</w:t>
+        <w:t xml:space="preserve">	5</w:t>
       </w:r>
     </w:p>
     <w:p>
@@ -247,7 +247,7 @@
           <w:sz w:val="19"/>
           <w:szCs w:val="19"/>
         </w:rPr>
-        <w:t xml:space="preserve">	4</w:t>
+        <w:t xml:space="preserve">	5</w:t>
       </w:r>
     </w:p>
     <w:p>
@@ -275,7 +275,7 @@
           <w:sz w:val="19"/>
           <w:szCs w:val="19"/>
         </w:rPr>
-        <w:t xml:space="preserve">	4</w:t>
+        <w:t xml:space="preserve">	5</w:t>
       </w:r>
     </w:p>
     <w:p>
@@ -303,7 +303,7 @@
           <w:sz w:val="19"/>
           <w:szCs w:val="19"/>
         </w:rPr>
-        <w:t xml:space="preserve">	5</w:t>
+        <w:t xml:space="preserve">	6</w:t>
       </w:r>
     </w:p>
     <w:p>
@@ -322,7 +322,7 @@
           <w:sz w:val="19"/>
           <w:szCs w:val="19"/>
         </w:rPr>
-        <w:t xml:space="preserve">1.6  Deliverable Summary</w:t>
+        <w:t xml:space="preserve">1.6  Framing the Foundation</w:t>
       </w:r>
       <w:r>
         <w:rPr>
@@ -331,7 +331,7 @@
           <w:sz w:val="19"/>
           <w:szCs w:val="19"/>
         </w:rPr>
-        <w:t xml:space="preserve">	5</w:t>
+        <w:t xml:space="preserve">	6</w:t>
       </w:r>
     </w:p>
     <w:p>
@@ -358,7 +358,7 @@
           <w:sz w:val="20"/>
           <w:szCs w:val="20"/>
         </w:rPr>
-        <w:t xml:space="preserve">	6</w:t>
+        <w:t xml:space="preserve">	7</w:t>
       </w:r>
     </w:p>
     <w:p>
@@ -386,7 +386,7 @@
           <w:sz w:val="19"/>
           <w:szCs w:val="19"/>
         </w:rPr>
-        <w:t xml:space="preserve">	6</w:t>
+        <w:t xml:space="preserve">	7</w:t>
       </w:r>
     </w:p>
     <w:p>
@@ -414,7 +414,7 @@
           <w:sz w:val="19"/>
           <w:szCs w:val="19"/>
         </w:rPr>
-        <w:t xml:space="preserve">	6</w:t>
+        <w:t xml:space="preserve">	7</w:t>
       </w:r>
     </w:p>
     <w:p>
@@ -442,7 +442,7 @@
           <w:sz w:val="19"/>
           <w:szCs w:val="19"/>
         </w:rPr>
-        <w:t xml:space="preserve">	6</w:t>
+        <w:t xml:space="preserve">	7</w:t>
       </w:r>
     </w:p>
     <w:p>
@@ -470,7 +470,7 @@
           <w:sz w:val="19"/>
           <w:szCs w:val="19"/>
         </w:rPr>
-        <w:t xml:space="preserve">	7</w:t>
+        <w:t xml:space="preserve">	8</w:t>
       </w:r>
     </w:p>
     <w:p>
@@ -489,7 +489,7 @@
           <w:sz w:val="19"/>
           <w:szCs w:val="19"/>
         </w:rPr>
-        <w:t xml:space="preserve">2.5  Deliverable Summary</w:t>
+        <w:t xml:space="preserve">2.5  A Trustworthy Data Basis</w:t>
       </w:r>
       <w:r>
         <w:rPr>
@@ -498,7 +498,7 @@
           <w:sz w:val="19"/>
           <w:szCs w:val="19"/>
         </w:rPr>
-        <w:t xml:space="preserve">	8</w:t>
+        <w:t xml:space="preserve">	9</w:t>
       </w:r>
     </w:p>
     <w:p>
@@ -525,7 +525,7 @@
           <w:sz w:val="20"/>
           <w:szCs w:val="20"/>
         </w:rPr>
-        <w:t xml:space="preserve">	9</w:t>
+        <w:t xml:space="preserve">	10</w:t>
       </w:r>
     </w:p>
     <w:p>
@@ -553,7 +553,7 @@
           <w:sz w:val="19"/>
           <w:szCs w:val="19"/>
         </w:rPr>
-        <w:t xml:space="preserve">	9</w:t>
+        <w:t xml:space="preserve">	10</w:t>
       </w:r>
     </w:p>
     <w:p>
@@ -581,7 +581,7 @@
           <w:sz w:val="19"/>
           <w:szCs w:val="19"/>
         </w:rPr>
-        <w:t xml:space="preserve">	9</w:t>
+        <w:t xml:space="preserve">	10</w:t>
       </w:r>
     </w:p>
     <w:p>
@@ -609,7 +609,7 @@
           <w:sz w:val="19"/>
           <w:szCs w:val="19"/>
         </w:rPr>
-        <w:t xml:space="preserve">	12</w:t>
+        <w:t xml:space="preserve">	13</w:t>
       </w:r>
     </w:p>
     <w:p>
@@ -637,7 +637,7 @@
           <w:sz w:val="19"/>
           <w:szCs w:val="19"/>
         </w:rPr>
-        <w:t xml:space="preserve">	12</w:t>
+        <w:t xml:space="preserve">	13</w:t>
       </w:r>
     </w:p>
     <w:p>
@@ -665,7 +665,7 @@
           <w:sz w:val="19"/>
           <w:szCs w:val="19"/>
         </w:rPr>
-        <w:t xml:space="preserve">	13</w:t>
+        <w:t xml:space="preserve">	14</w:t>
       </w:r>
     </w:p>
     <w:p>
@@ -693,7 +693,7 @@
           <w:sz w:val="19"/>
           <w:szCs w:val="19"/>
         </w:rPr>
-        <w:t xml:space="preserve">	13</w:t>
+        <w:t xml:space="preserve">	14</w:t>
       </w:r>
     </w:p>
     <w:p>
@@ -712,7 +712,7 @@
           <w:sz w:val="19"/>
           <w:szCs w:val="19"/>
         </w:rPr>
-        <w:t xml:space="preserve">3.7  Deliverable Summary</w:t>
+        <w:t xml:space="preserve">3.7  Signal Ready for Modelling</w:t>
       </w:r>
       <w:r>
         <w:rPr>
@@ -721,7 +721,7 @@
           <w:sz w:val="19"/>
           <w:szCs w:val="19"/>
         </w:rPr>
-        <w:t xml:space="preserve">	14</w:t>
+        <w:t xml:space="preserve">	15</w:t>
       </w:r>
     </w:p>
     <w:p>
@@ -879,7 +879,7 @@
           <w:sz w:val="19"/>
           <w:szCs w:val="19"/>
         </w:rPr>
-        <w:t xml:space="preserve">4.5  Deliverable Summary</w:t>
+        <w:t xml:space="preserve">4.5  The Operational Detector</w:t>
       </w:r>
       <w:r>
         <w:rPr>
@@ -1102,7 +1102,7 @@
           <w:sz w:val="19"/>
           <w:szCs w:val="19"/>
         </w:rPr>
-        <w:t xml:space="preserve">5.7  Deliverable Summary</w:t>
+        <w:t xml:space="preserve">5.7  Trust, Tested and Earned</w:t>
       </w:r>
       <w:r>
         <w:rPr>
@@ -1129,7 +1129,7 @@
           <w:sz w:val="20"/>
           <w:szCs w:val="20"/>
         </w:rPr>
-        <w:t xml:space="preserve">References</w:t>
+        <w:t xml:space="preserve">6  Final Presentation &amp; Communication</w:t>
       </w:r>
       <w:r>
         <w:rPr>
@@ -1139,6 +1139,534 @@
           <w:szCs w:val="20"/>
         </w:rPr>
         <w:t xml:space="preserve">	25</w:t>
+      </w:r>
+    </w:p>
+    <w:p>
+      <w:pPr>
+        <w:tabs>
+          <w:tab w:val="right" w:pos="9200" w:leader="dot"/>
+        </w:tabs>
+        <w:spacing w:after="10" w:before="0"/>
+        <w:ind w:left="360"/>
+      </w:pPr>
+      <w:r>
+        <w:rPr>
+          <w:b w:val="false"/>
+          <w:bCs w:val="false"/>
+          <w:color w:val="000000"/>
+          <w:sz w:val="19"/>
+          <w:szCs w:val="19"/>
+        </w:rPr>
+        <w:t xml:space="preserve">6.1  Two Audiences, Two Decks</w:t>
+      </w:r>
+      <w:r>
+        <w:rPr>
+          <w:b w:val="false"/>
+          <w:bCs w:val="false"/>
+          <w:sz w:val="19"/>
+          <w:szCs w:val="19"/>
+        </w:rPr>
+        <w:t xml:space="preserve">	25</w:t>
+      </w:r>
+    </w:p>
+    <w:p>
+      <w:pPr>
+        <w:tabs>
+          <w:tab w:val="right" w:pos="9200" w:leader="dot"/>
+        </w:tabs>
+        <w:spacing w:after="10" w:before="0"/>
+        <w:ind w:left="360"/>
+      </w:pPr>
+      <w:r>
+        <w:rPr>
+          <w:b w:val="false"/>
+          <w:bCs w:val="false"/>
+          <w:color w:val="000000"/>
+          <w:sz w:val="19"/>
+          <w:szCs w:val="19"/>
+        </w:rPr>
+        <w:t xml:space="preserve">6.2  Technical Deck (Peers)</w:t>
+      </w:r>
+      <w:r>
+        <w:rPr>
+          <w:b w:val="false"/>
+          <w:bCs w:val="false"/>
+          <w:sz w:val="19"/>
+          <w:szCs w:val="19"/>
+        </w:rPr>
+        <w:t xml:space="preserve">	25</w:t>
+      </w:r>
+    </w:p>
+    <w:p>
+      <w:pPr>
+        <w:tabs>
+          <w:tab w:val="right" w:pos="9200" w:leader="dot"/>
+        </w:tabs>
+        <w:spacing w:after="10" w:before="0"/>
+        <w:ind w:left="360"/>
+      </w:pPr>
+      <w:r>
+        <w:rPr>
+          <w:b w:val="false"/>
+          <w:bCs w:val="false"/>
+          <w:color w:val="000000"/>
+          <w:sz w:val="19"/>
+          <w:szCs w:val="19"/>
+        </w:rPr>
+        <w:t xml:space="preserve">6.3  Business Deck (Executives)</w:t>
+      </w:r>
+      <w:r>
+        <w:rPr>
+          <w:b w:val="false"/>
+          <w:bCs w:val="false"/>
+          <w:sz w:val="19"/>
+          <w:szCs w:val="19"/>
+        </w:rPr>
+        <w:t xml:space="preserve">	25</w:t>
+      </w:r>
+    </w:p>
+    <w:p>
+      <w:pPr>
+        <w:tabs>
+          <w:tab w:val="right" w:pos="9200" w:leader="dot"/>
+        </w:tabs>
+        <w:spacing w:after="10" w:before="0"/>
+        <w:ind w:left="360"/>
+      </w:pPr>
+      <w:r>
+        <w:rPr>
+          <w:b w:val="false"/>
+          <w:bCs w:val="false"/>
+          <w:color w:val="000000"/>
+          <w:sz w:val="19"/>
+          <w:szCs w:val="19"/>
+        </w:rPr>
+        <w:t xml:space="preserve">6.4  Communicating to Every Audience</w:t>
+      </w:r>
+      <w:r>
+        <w:rPr>
+          <w:b w:val="false"/>
+          <w:bCs w:val="false"/>
+          <w:sz w:val="19"/>
+          <w:szCs w:val="19"/>
+        </w:rPr>
+        <w:t xml:space="preserve">	26</w:t>
+      </w:r>
+    </w:p>
+    <w:p>
+      <w:pPr>
+        <w:tabs>
+          <w:tab w:val="right" w:pos="9200" w:leader="dot"/>
+        </w:tabs>
+        <w:spacing w:after="20" w:before="80"/>
+      </w:pPr>
+      <w:r>
+        <w:rPr>
+          <w:b/>
+          <w:bCs/>
+          <w:color w:val="1F4E79"/>
+          <w:sz w:val="20"/>
+          <w:szCs w:val="20"/>
+        </w:rPr>
+        <w:t xml:space="preserve">7  GitHub Repository &amp; Reproducibility</w:t>
+      </w:r>
+      <w:r>
+        <w:rPr>
+          <w:b/>
+          <w:bCs/>
+          <w:sz w:val="20"/>
+          <w:szCs w:val="20"/>
+        </w:rPr>
+        <w:t xml:space="preserve">	27</w:t>
+      </w:r>
+    </w:p>
+    <w:p>
+      <w:pPr>
+        <w:tabs>
+          <w:tab w:val="right" w:pos="9200" w:leader="dot"/>
+        </w:tabs>
+        <w:spacing w:after="10" w:before="0"/>
+        <w:ind w:left="360"/>
+      </w:pPr>
+      <w:r>
+        <w:rPr>
+          <w:b w:val="false"/>
+          <w:bCs w:val="false"/>
+          <w:color w:val="000000"/>
+          <w:sz w:val="19"/>
+          <w:szCs w:val="19"/>
+        </w:rPr>
+        <w:t xml:space="preserve">7.1  Repository Structure</w:t>
+      </w:r>
+      <w:r>
+        <w:rPr>
+          <w:b w:val="false"/>
+          <w:bCs w:val="false"/>
+          <w:sz w:val="19"/>
+          <w:szCs w:val="19"/>
+        </w:rPr>
+        <w:t xml:space="preserve">	27</w:t>
+      </w:r>
+    </w:p>
+    <w:p>
+      <w:pPr>
+        <w:tabs>
+          <w:tab w:val="right" w:pos="9200" w:leader="dot"/>
+        </w:tabs>
+        <w:spacing w:after="10" w:before="0"/>
+        <w:ind w:left="360"/>
+      </w:pPr>
+      <w:r>
+        <w:rPr>
+          <w:b w:val="false"/>
+          <w:bCs w:val="false"/>
+          <w:color w:val="000000"/>
+          <w:sz w:val="19"/>
+          <w:szCs w:val="19"/>
+        </w:rPr>
+        <w:t xml:space="preserve">7.2  Reproducible Code &amp; Environment</w:t>
+      </w:r>
+      <w:r>
+        <w:rPr>
+          <w:b w:val="false"/>
+          <w:bCs w:val="false"/>
+          <w:sz w:val="19"/>
+          <w:szCs w:val="19"/>
+        </w:rPr>
+        <w:t xml:space="preserve">	27</w:t>
+      </w:r>
+    </w:p>
+    <w:p>
+      <w:pPr>
+        <w:tabs>
+          <w:tab w:val="right" w:pos="9200" w:leader="dot"/>
+        </w:tabs>
+        <w:spacing w:after="10" w:before="0"/>
+        <w:ind w:left="360"/>
+      </w:pPr>
+      <w:r>
+        <w:rPr>
+          <w:b w:val="false"/>
+          <w:bCs w:val="false"/>
+          <w:color w:val="000000"/>
+          <w:sz w:val="19"/>
+          <w:szCs w:val="19"/>
+        </w:rPr>
+        <w:t xml:space="preserve">7.3  Built to Be Reproduced</w:t>
+      </w:r>
+      <w:r>
+        <w:rPr>
+          <w:b w:val="false"/>
+          <w:bCs w:val="false"/>
+          <w:sz w:val="19"/>
+          <w:szCs w:val="19"/>
+        </w:rPr>
+        <w:t xml:space="preserve">	27</w:t>
+      </w:r>
+    </w:p>
+    <w:p>
+      <w:pPr>
+        <w:tabs>
+          <w:tab w:val="right" w:pos="9200" w:leader="dot"/>
+        </w:tabs>
+        <w:spacing w:after="20" w:before="80"/>
+      </w:pPr>
+      <w:r>
+        <w:rPr>
+          <w:b/>
+          <w:bCs/>
+          <w:color w:val="1F4E79"/>
+          <w:sz w:val="20"/>
+          <w:szCs w:val="20"/>
+        </w:rPr>
+        <w:t xml:space="preserve">8  Deployment &amp; MLOps</w:t>
+      </w:r>
+      <w:r>
+        <w:rPr>
+          <w:b/>
+          <w:bCs/>
+          <w:sz w:val="20"/>
+          <w:szCs w:val="20"/>
+        </w:rPr>
+        <w:t xml:space="preserve">	28</w:t>
+      </w:r>
+    </w:p>
+    <w:p>
+      <w:pPr>
+        <w:tabs>
+          <w:tab w:val="right" w:pos="9200" w:leader="dot"/>
+        </w:tabs>
+        <w:spacing w:after="10" w:before="0"/>
+        <w:ind w:left="360"/>
+      </w:pPr>
+      <w:r>
+        <w:rPr>
+          <w:b w:val="false"/>
+          <w:bCs w:val="false"/>
+          <w:color w:val="000000"/>
+          <w:sz w:val="19"/>
+          <w:szCs w:val="19"/>
+        </w:rPr>
+        <w:t xml:space="preserve">8.1  Serving the Model</w:t>
+      </w:r>
+      <w:r>
+        <w:rPr>
+          <w:b w:val="false"/>
+          <w:bCs w:val="false"/>
+          <w:sz w:val="19"/>
+          <w:szCs w:val="19"/>
+        </w:rPr>
+        <w:t xml:space="preserve">	28</w:t>
+      </w:r>
+    </w:p>
+    <w:p>
+      <w:pPr>
+        <w:tabs>
+          <w:tab w:val="right" w:pos="9200" w:leader="dot"/>
+        </w:tabs>
+        <w:spacing w:after="10" w:before="0"/>
+        <w:ind w:left="360"/>
+      </w:pPr>
+      <w:r>
+        <w:rPr>
+          <w:b w:val="false"/>
+          <w:bCs w:val="false"/>
+          <w:color w:val="000000"/>
+          <w:sz w:val="19"/>
+          <w:szCs w:val="19"/>
+        </w:rPr>
+        <w:t xml:space="preserve">8.2  Containerisation &amp; Configuration</w:t>
+      </w:r>
+      <w:r>
+        <w:rPr>
+          <w:b w:val="false"/>
+          <w:bCs w:val="false"/>
+          <w:sz w:val="19"/>
+          <w:szCs w:val="19"/>
+        </w:rPr>
+        <w:t xml:space="preserve">	28</w:t>
+      </w:r>
+    </w:p>
+    <w:p>
+      <w:pPr>
+        <w:tabs>
+          <w:tab w:val="right" w:pos="9200" w:leader="dot"/>
+        </w:tabs>
+        <w:spacing w:after="10" w:before="0"/>
+        <w:ind w:left="360"/>
+      </w:pPr>
+      <w:r>
+        <w:rPr>
+          <w:b w:val="false"/>
+          <w:bCs w:val="false"/>
+          <w:color w:val="000000"/>
+          <w:sz w:val="19"/>
+          <w:szCs w:val="19"/>
+        </w:rPr>
+        <w:t xml:space="preserve">8.3  MLOps Practices</w:t>
+      </w:r>
+      <w:r>
+        <w:rPr>
+          <w:b w:val="false"/>
+          <w:bCs w:val="false"/>
+          <w:sz w:val="19"/>
+          <w:szCs w:val="19"/>
+        </w:rPr>
+        <w:t xml:space="preserve">	29</w:t>
+      </w:r>
+    </w:p>
+    <w:p>
+      <w:pPr>
+        <w:tabs>
+          <w:tab w:val="right" w:pos="9200" w:leader="dot"/>
+        </w:tabs>
+        <w:spacing w:after="10" w:before="0"/>
+        <w:ind w:left="360"/>
+      </w:pPr>
+      <w:r>
+        <w:rPr>
+          <w:b w:val="false"/>
+          <w:bCs w:val="false"/>
+          <w:color w:val="000000"/>
+          <w:sz w:val="19"/>
+          <w:szCs w:val="19"/>
+        </w:rPr>
+        <w:t xml:space="preserve">8.4  From Model to Service</w:t>
+      </w:r>
+      <w:r>
+        <w:rPr>
+          <w:b w:val="false"/>
+          <w:bCs w:val="false"/>
+          <w:sz w:val="19"/>
+          <w:szCs w:val="19"/>
+        </w:rPr>
+        <w:t xml:space="preserve">	29</w:t>
+      </w:r>
+    </w:p>
+    <w:p>
+      <w:pPr>
+        <w:tabs>
+          <w:tab w:val="right" w:pos="9200" w:leader="dot"/>
+        </w:tabs>
+        <w:spacing w:after="20" w:before="80"/>
+      </w:pPr>
+      <w:r>
+        <w:rPr>
+          <w:b/>
+          <w:bCs/>
+          <w:color w:val="1F4E79"/>
+          <w:sz w:val="20"/>
+          <w:szCs w:val="20"/>
+        </w:rPr>
+        <w:t xml:space="preserve">9  Use of Generative AI</w:t>
+      </w:r>
+      <w:r>
+        <w:rPr>
+          <w:b/>
+          <w:bCs/>
+          <w:sz w:val="20"/>
+          <w:szCs w:val="20"/>
+        </w:rPr>
+        <w:t xml:space="preserve">	30</w:t>
+      </w:r>
+    </w:p>
+    <w:p>
+      <w:pPr>
+        <w:tabs>
+          <w:tab w:val="right" w:pos="9200" w:leader="dot"/>
+        </w:tabs>
+        <w:spacing w:after="10" w:before="0"/>
+        <w:ind w:left="360"/>
+      </w:pPr>
+      <w:r>
+        <w:rPr>
+          <w:b w:val="false"/>
+          <w:bCs w:val="false"/>
+          <w:color w:val="000000"/>
+          <w:sz w:val="19"/>
+          <w:szCs w:val="19"/>
+        </w:rPr>
+        <w:t xml:space="preserve">9.1  Where It Was Used</w:t>
+      </w:r>
+      <w:r>
+        <w:rPr>
+          <w:b w:val="false"/>
+          <w:bCs w:val="false"/>
+          <w:sz w:val="19"/>
+          <w:szCs w:val="19"/>
+        </w:rPr>
+        <w:t xml:space="preserve">	30</w:t>
+      </w:r>
+    </w:p>
+    <w:p>
+      <w:pPr>
+        <w:tabs>
+          <w:tab w:val="right" w:pos="9200" w:leader="dot"/>
+        </w:tabs>
+        <w:spacing w:after="10" w:before="0"/>
+        <w:ind w:left="360"/>
+      </w:pPr>
+      <w:r>
+        <w:rPr>
+          <w:b w:val="false"/>
+          <w:bCs w:val="false"/>
+          <w:color w:val="000000"/>
+          <w:sz w:val="19"/>
+          <w:szCs w:val="19"/>
+        </w:rPr>
+        <w:t xml:space="preserve">9.2  A GenAI-Enhanced Feature</w:t>
+      </w:r>
+      <w:r>
+        <w:rPr>
+          <w:b w:val="false"/>
+          <w:bCs w:val="false"/>
+          <w:sz w:val="19"/>
+          <w:szCs w:val="19"/>
+        </w:rPr>
+        <w:t xml:space="preserve">	30</w:t>
+      </w:r>
+    </w:p>
+    <w:p>
+      <w:pPr>
+        <w:tabs>
+          <w:tab w:val="right" w:pos="9200" w:leader="dot"/>
+        </w:tabs>
+        <w:spacing w:after="10" w:before="0"/>
+        <w:ind w:left="360"/>
+      </w:pPr>
+      <w:r>
+        <w:rPr>
+          <w:b w:val="false"/>
+          <w:bCs w:val="false"/>
+          <w:color w:val="000000"/>
+          <w:sz w:val="19"/>
+          <w:szCs w:val="19"/>
+        </w:rPr>
+        <w:t xml:space="preserve">9.3  Responsible Use</w:t>
+      </w:r>
+      <w:r>
+        <w:rPr>
+          <w:b w:val="false"/>
+          <w:bCs w:val="false"/>
+          <w:sz w:val="19"/>
+          <w:szCs w:val="19"/>
+        </w:rPr>
+        <w:t xml:space="preserve">	30</w:t>
+      </w:r>
+    </w:p>
+    <w:p>
+      <w:pPr>
+        <w:tabs>
+          <w:tab w:val="right" w:pos="9200" w:leader="dot"/>
+        </w:tabs>
+        <w:spacing w:after="10" w:before="0"/>
+        <w:ind w:left="360"/>
+      </w:pPr>
+      <w:r>
+        <w:rPr>
+          <w:b w:val="false"/>
+          <w:bCs w:val="false"/>
+          <w:color w:val="000000"/>
+          <w:sz w:val="19"/>
+          <w:szCs w:val="19"/>
+        </w:rPr>
+        <w:t xml:space="preserve">9.4  AI Used Responsibly</w:t>
+      </w:r>
+      <w:r>
+        <w:rPr>
+          <w:b w:val="false"/>
+          <w:bCs w:val="false"/>
+          <w:sz w:val="19"/>
+          <w:szCs w:val="19"/>
+        </w:rPr>
+        <w:t xml:space="preserve">	30</w:t>
+      </w:r>
+    </w:p>
+    <w:p>
+      <w:pPr>
+        <w:tabs>
+          <w:tab w:val="right" w:pos="9200" w:leader="dot"/>
+        </w:tabs>
+        <w:spacing w:after="20" w:before="80"/>
+      </w:pPr>
+      <w:r>
+        <w:rPr>
+          <w:b/>
+          <w:bCs/>
+          <w:color w:val="1F4E79"/>
+          <w:sz w:val="20"/>
+          <w:szCs w:val="20"/>
+        </w:rPr>
+        <w:t xml:space="preserve">References</w:t>
+      </w:r>
+      <w:r>
+        <w:rPr>
+          <w:b/>
+          <w:bCs/>
+          <w:sz w:val="20"/>
+          <w:szCs w:val="20"/>
+        </w:rPr>
+        <w:t xml:space="preserve">	32</w:t>
       </w:r>
     </w:p>
     <w:p>
@@ -1499,7 +2027,7 @@
           <w:bCs/>
           <w:color w:val="1F4E79"/>
         </w:rPr>
-        <w:t xml:space="preserve">1.6 Deliverable Summary</w:t>
+        <w:t xml:space="preserve">1.6 Framing the Foundation</w:t>
       </w:r>
     </w:p>
     <w:p>
@@ -1508,162 +2036,9 @@
         <w:jc w:val="both"/>
       </w:pPr>
       <w:r>
-        <w:t xml:space="preserve">In summary, Step 1 locks the problem as binary anomaly detection on UNSW-NB15, with recall and F1 on the attack class (supported by PR-AUC) as the target metrics. These decisions map directly to the early capstone stages and act as the contract the rest of the project is held against.</w:t>
-      </w:r>
-    </w:p>
-    <w:tbl>
-      <w:tblPr>
-        <w:tblW w:type="dxa" w:w="9360"/>
-        <w:tblBorders>
-          <w:top w:val="single" w:color="auto" w:sz="4"/>
-          <w:left w:val="single" w:color="auto" w:sz="4"/>
-          <w:bottom w:val="single" w:color="auto" w:sz="4"/>
-          <w:right w:val="single" w:color="auto" w:sz="4"/>
-          <w:insideH w:val="single" w:color="auto" w:sz="4"/>
-          <w:insideV w:val="single" w:color="auto" w:sz="4"/>
-        </w:tblBorders>
-      </w:tblPr>
-      <w:tblGrid>
-        <w:gridCol w:w="3000"/>
-        <w:gridCol w:w="6360"/>
-      </w:tblGrid>
-      <w:tr>
-        <w:tc>
-          <w:tcPr>
-            <w:tcW w:type="dxa" w:w="3000"/>
-            <w:shd w:fill="DDEBF7" w:val="clear"/>
-          </w:tcPr>
-          <w:p>
-            <w:pPr>
-              <w:spacing w:after="100"/>
-            </w:pPr>
-            <w:r>
-              <w:rPr>
-                <w:b/>
-                <w:bCs/>
-                <w:color w:val="1F4E79"/>
-              </w:rPr>
-              <w:t xml:space="preserve">Problem statement</w:t>
-            </w:r>
-          </w:p>
-        </w:tc>
-        <w:tc>
-          <w:tcPr>
-            <w:tcW w:type="dxa" w:w="6360"/>
-          </w:tcPr>
-          <w:p>
-            <w:pPr>
-              <w:spacing w:after="100"/>
-            </w:pPr>
-            <w:r>
-              <w:t xml:space="preserve">Automatically classify network connections as normal or attack to prioritise analyst investigation and reduce breach risk.</w:t>
-            </w:r>
-          </w:p>
-        </w:tc>
-      </w:tr>
-      <w:tr>
-        <w:tc>
-          <w:tcPr>
-            <w:tcW w:type="dxa" w:w="3000"/>
-            <w:shd w:fill="DDEBF7" w:val="clear"/>
-          </w:tcPr>
-          <w:p>
-            <w:pPr>
-              <w:spacing w:after="100"/>
-            </w:pPr>
-            <w:r>
-              <w:rPr>
-                <w:b/>
-                <w:bCs/>
-                <w:color w:val="1F4E79"/>
-              </w:rPr>
-              <w:t xml:space="preserve">Task type</w:t>
-            </w:r>
-          </w:p>
-        </w:tc>
-        <w:tc>
-          <w:tcPr>
-            <w:tcW w:type="dxa" w:w="6360"/>
-          </w:tcPr>
-          <w:p>
-            <w:pPr>
-              <w:spacing w:after="100"/>
-            </w:pPr>
-            <w:r>
-              <w:t xml:space="preserve">Binary classification / anomaly detection (extendable to multi-class).</w:t>
-            </w:r>
-          </w:p>
-        </w:tc>
-      </w:tr>
-      <w:tr>
-        <w:tc>
-          <w:tcPr>
-            <w:tcW w:type="dxa" w:w="3000"/>
-            <w:shd w:fill="DDEBF7" w:val="clear"/>
-          </w:tcPr>
-          <w:p>
-            <w:pPr>
-              <w:spacing w:after="100"/>
-            </w:pPr>
-            <w:r>
-              <w:rPr>
-                <w:b/>
-                <w:bCs/>
-                <w:color w:val="1F4E79"/>
-              </w:rPr>
-              <w:t xml:space="preserve">Target metric</w:t>
-            </w:r>
-          </w:p>
-        </w:tc>
-        <w:tc>
-          <w:tcPr>
-            <w:tcW w:type="dxa" w:w="6360"/>
-          </w:tcPr>
-          <w:p>
-            <w:pPr>
-              <w:spacing w:after="100"/>
-            </w:pPr>
-            <w:r>
-              <w:t xml:space="preserve">Recall and F1 on the attack class, supported by PR-AUC.</w:t>
-            </w:r>
-          </w:p>
-        </w:tc>
-      </w:tr>
-      <w:tr>
-        <w:tc>
-          <w:tcPr>
-            <w:tcW w:type="dxa" w:w="3000"/>
-            <w:shd w:fill="DDEBF7" w:val="clear"/>
-          </w:tcPr>
-          <w:p>
-            <w:pPr>
-              <w:spacing w:after="100"/>
-            </w:pPr>
-            <w:r>
-              <w:rPr>
-                <w:b/>
-                <w:bCs/>
-                <w:color w:val="1F4E79"/>
-              </w:rPr>
-              <w:t xml:space="preserve">Capstone linkage</w:t>
-            </w:r>
-          </w:p>
-        </w:tc>
-        <w:tc>
-          <w:tcPr>
-            <w:tcW w:type="dxa" w:w="6360"/>
-          </w:tcPr>
-          <w:p>
-            <w:pPr>
-              <w:spacing w:after="100"/>
-            </w:pPr>
-            <w:r>
-              <w:t xml:space="preserve">Module 1 output maps to Capstone Steps 1–3.</w:t>
-            </w:r>
-          </w:p>
-        </w:tc>
-      </w:tr>
-    </w:tbl>
+        <w:t xml:space="preserve">With the problem fixed as binary anomaly detection and recall on the attack class established as the metric that governs every later decision, the project has a clear contract to build against. This framing deliberately privileges catching intrusions over avoiding the occasional false alarm, and it binds each technical choice that follows — sampling, thresholds, model selection — to a business cost rather than an abstract score. The chapters ahead are, in effect, a sustained attempt to satisfy that contract and to prove, with evidence, that it has been met.</w:t>
+      </w:r>
+    </w:p>
     <w:p>
       <w:r>
         <w:br w:type="page"/>
@@ -6127,7 +6502,7 @@
           <w:bCs/>
           <w:color w:val="1F4E79"/>
         </w:rPr>
-        <w:t xml:space="preserve">2.5 Deliverable Summary</w:t>
+        <w:t xml:space="preserve">2.5 A Trustworthy Data Basis</w:t>
       </w:r>
     </w:p>
     <w:p>
@@ -6136,128 +6511,9 @@
         <w:jc w:val="both"/>
       </w:pPr>
       <w:r>
-        <w:t xml:space="preserve">In summary, Step 2 confirms a high-quality, richly featured dataset and delivers a complete data dictionary and quality assessment. The known quirks of encoded placeholder, skew, and imbalance are now explicit inputs to preprocessing rather than surprises waiting downstream.</w:t>
-      </w:r>
-    </w:p>
-    <w:tbl>
-      <w:tblPr>
-        <w:tblW w:type="dxa" w:w="9360"/>
-        <w:tblBorders>
-          <w:top w:val="single" w:color="auto" w:sz="4"/>
-          <w:left w:val="single" w:color="auto" w:sz="4"/>
-          <w:bottom w:val="single" w:color="auto" w:sz="4"/>
-          <w:right w:val="single" w:color="auto" w:sz="4"/>
-          <w:insideH w:val="single" w:color="auto" w:sz="4"/>
-          <w:insideV w:val="single" w:color="auto" w:sz="4"/>
-        </w:tblBorders>
-      </w:tblPr>
-      <w:tblGrid>
-        <w:gridCol w:w="3000"/>
-        <w:gridCol w:w="6360"/>
-      </w:tblGrid>
-      <w:tr>
-        <w:tc>
-          <w:tcPr>
-            <w:tcW w:type="dxa" w:w="3000"/>
-            <w:shd w:fill="DDEBF7" w:val="clear"/>
-          </w:tcPr>
-          <w:p>
-            <w:pPr>
-              <w:spacing w:after="100"/>
-            </w:pPr>
-            <w:r>
-              <w:rPr>
-                <w:b/>
-                <w:bCs/>
-                <w:color w:val="1F4E79"/>
-              </w:rPr>
-              <w:t xml:space="preserve">Dataset</w:t>
-            </w:r>
-          </w:p>
-        </w:tc>
-        <w:tc>
-          <w:tcPr>
-            <w:tcW w:type="dxa" w:w="6360"/>
-          </w:tcPr>
-          <w:p>
-            <w:pPr>
-              <w:spacing w:after="100"/>
-            </w:pPr>
-            <w:r>
-              <w:t xml:space="preserve">UNSW-NB15 (ACCS, 2015) — official train/test split, 175,341 / 82,332 records, 45 columns.</w:t>
-            </w:r>
-          </w:p>
-        </w:tc>
-      </w:tr>
-      <w:tr>
-        <w:tc>
-          <w:tcPr>
-            <w:tcW w:type="dxa" w:w="3000"/>
-            <w:shd w:fill="DDEBF7" w:val="clear"/>
-          </w:tcPr>
-          <w:p>
-            <w:pPr>
-              <w:spacing w:after="100"/>
-            </w:pPr>
-            <w:r>
-              <w:rPr>
-                <w:b/>
-                <w:bCs/>
-                <w:color w:val="1F4E79"/>
-              </w:rPr>
-              <w:t xml:space="preserve">Quality</w:t>
-            </w:r>
-          </w:p>
-        </w:tc>
-        <w:tc>
-          <w:tcPr>
-            <w:tcW w:type="dxa" w:w="6360"/>
-          </w:tcPr>
-          <w:p>
-            <w:pPr>
-              <w:spacing w:after="100"/>
-            </w:pPr>
-            <w:r>
-              <w:t xml:space="preserve">No missing values or duplicates; encoded placeholder in service; heavy right-skew outliers to be scaled.</w:t>
-            </w:r>
-          </w:p>
-        </w:tc>
-      </w:tr>
-      <w:tr>
-        <w:tc>
-          <w:tcPr>
-            <w:tcW w:type="dxa" w:w="3000"/>
-            <w:shd w:fill="DDEBF7" w:val="clear"/>
-          </w:tcPr>
-          <w:p>
-            <w:pPr>
-              <w:spacing w:after="100"/>
-            </w:pPr>
-            <w:r>
-              <w:rPr>
-                <w:b/>
-                <w:bCs/>
-                <w:color w:val="1F4E79"/>
-              </w:rPr>
-              <w:t xml:space="preserve">Data dictionary</w:t>
-            </w:r>
-          </w:p>
-        </w:tc>
-        <w:tc>
-          <w:tcPr>
-            <w:tcW w:type="dxa" w:w="6360"/>
-          </w:tcPr>
-          <w:p>
-            <w:pPr>
-              <w:spacing w:after="100"/>
-            </w:pPr>
-            <w:r>
-              <w:t xml:space="preserve">Full 45-column dictionary provided above (type, unit/allowed values, description).</w:t>
-            </w:r>
-          </w:p>
-        </w:tc>
-      </w:tr>
-    </w:tbl>
+        <w:t xml:space="preserve">The dataset is now fully characterised: its origin and realism understood, every one of its forty-five columns catalogued with type, unit, and meaning, and its three consequential quirks — the encoded service placeholder, the heavy right-skew of the volume features, and the severe imbalance among attack families — surfaced rather than left to ambush the modelling stage. Because these properties are known in advance, the preprocessing that follows can be designed deliberately for them instead of reacting to failures later. The data has moved from an opaque file to a well-understood foundation on which the rest of the pipeline can safely rest.</w:t>
+      </w:r>
+    </w:p>
     <w:p>
       <w:r>
         <w:br w:type="page"/>
@@ -7182,7 +7438,7 @@
           <w:bCs/>
           <w:color w:val="1F4E79"/>
         </w:rPr>
-        <w:t xml:space="preserve">3.7 Deliverable Summary</w:t>
+        <w:t xml:space="preserve">3.7 Signal Ready for Modelling</w:t>
       </w:r>
     </w:p>
     <w:p>
@@ -7191,196 +7447,9 @@
         <w:jc w:val="both"/>
       </w:pPr>
       <w:r>
-        <w:t xml:space="preserve">In summary, Step 3 delivers a reproducible, leakage-safe pipeline, an interpretable feature set, and clear evidence of what separates attacks from normal traffic. The EDA and explainability findings both justify the preprocessing choices and set expectations for modelling.</w:t>
-      </w:r>
-    </w:p>
-    <w:tbl>
-      <w:tblPr>
-        <w:tblW w:type="dxa" w:w="9360"/>
-        <w:tblBorders>
-          <w:top w:val="single" w:color="auto" w:sz="4"/>
-          <w:left w:val="single" w:color="auto" w:sz="4"/>
-          <w:bottom w:val="single" w:color="auto" w:sz="4"/>
-          <w:right w:val="single" w:color="auto" w:sz="4"/>
-          <w:insideH w:val="single" w:color="auto" w:sz="4"/>
-          <w:insideV w:val="single" w:color="auto" w:sz="4"/>
-        </w:tblBorders>
-      </w:tblPr>
-      <w:tblGrid>
-        <w:gridCol w:w="3000"/>
-        <w:gridCol w:w="6360"/>
-      </w:tblGrid>
-      <w:tr>
-        <w:tc>
-          <w:tcPr>
-            <w:tcW w:type="dxa" w:w="3000"/>
-            <w:shd w:fill="DDEBF7" w:val="clear"/>
-          </w:tcPr>
-          <w:p>
-            <w:pPr>
-              <w:spacing w:after="100"/>
-            </w:pPr>
-            <w:r>
-              <w:rPr>
-                <w:b/>
-                <w:bCs/>
-                <w:color w:val="1F4E79"/>
-              </w:rPr>
-              <w:t xml:space="preserve">Cleaning</w:t>
-            </w:r>
-          </w:p>
-        </w:tc>
-        <w:tc>
-          <w:tcPr>
-            <w:tcW w:type="dxa" w:w="6360"/>
-          </w:tcPr>
-          <w:p>
-            <w:pPr>
-              <w:spacing w:after="100"/>
-            </w:pPr>
-            <w:r>
-              <w:t xml:space="preserve">id dropped; service '-' recoded; outliers log-compressed + robust-scaled; no nulls/dupes.</w:t>
-            </w:r>
-          </w:p>
-        </w:tc>
-      </w:tr>
-      <w:tr>
-        <w:tc>
-          <w:tcPr>
-            <w:tcW w:type="dxa" w:w="3000"/>
-            <w:shd w:fill="DDEBF7" w:val="clear"/>
-          </w:tcPr>
-          <w:p>
-            <w:pPr>
-              <w:spacing w:after="100"/>
-            </w:pPr>
-            <w:r>
-              <w:rPr>
-                <w:b/>
-                <w:bCs/>
-                <w:color w:val="1F4E79"/>
-              </w:rPr>
-              <w:t xml:space="preserve">Engineering</w:t>
-            </w:r>
-          </w:p>
-        </w:tc>
-        <w:tc>
-          <w:tcPr>
-            <w:tcW w:type="dxa" w:w="6360"/>
-          </w:tcPr>
-          <w:p>
-            <w:pPr>
-              <w:spacing w:after="100"/>
-            </w:pPr>
-            <w:r>
-              <w:t xml:space="preserve">7 domain features; one-hot (service, state) + frequency-encode (proto); 69 features total.</w:t>
-            </w:r>
-          </w:p>
-        </w:tc>
-      </w:tr>
-      <w:tr>
-        <w:tc>
-          <w:tcPr>
-            <w:tcW w:type="dxa" w:w="3000"/>
-            <w:shd w:fill="DDEBF7" w:val="clear"/>
-          </w:tcPr>
-          <w:p>
-            <w:pPr>
-              <w:spacing w:after="100"/>
-            </w:pPr>
-            <w:r>
-              <w:rPr>
-                <w:b/>
-                <w:bCs/>
-                <w:color w:val="1F4E79"/>
-              </w:rPr>
-              <w:t xml:space="preserve">Explainability</w:t>
-            </w:r>
-          </w:p>
-        </w:tc>
-        <w:tc>
-          <w:tcPr>
-            <w:tcW w:type="dxa" w:w="6360"/>
-          </w:tcPr>
-          <w:p>
-            <w:pPr>
-              <w:spacing w:after="100"/>
-            </w:pPr>
-            <w:r>
-              <w:t xml:space="preserve">RF importance + SHAP agree — TTL features dominate; 2 engineered features in top 5.</w:t>
-            </w:r>
-          </w:p>
-        </w:tc>
-      </w:tr>
-      <w:tr>
-        <w:tc>
-          <w:tcPr>
-            <w:tcW w:type="dxa" w:w="3000"/>
-            <w:shd w:fill="DDEBF7" w:val="clear"/>
-          </w:tcPr>
-          <w:p>
-            <w:pPr>
-              <w:spacing w:after="100"/>
-            </w:pPr>
-            <w:r>
-              <w:rPr>
-                <w:b/>
-                <w:bCs/>
-                <w:color w:val="1F4E79"/>
-              </w:rPr>
-              <w:t xml:space="preserve">Selection / PCA</w:t>
-            </w:r>
-          </w:p>
-        </w:tc>
-        <w:tc>
-          <w:tcPr>
-            <w:tcW w:type="dxa" w:w="6360"/>
-          </w:tcPr>
-          <w:p>
-            <w:pPr>
-              <w:spacing w:after="100"/>
-            </w:pPr>
-            <w:r>
-              <w:t xml:space="preserve">21-feature embedded+filter set; PCA needs 31/69 components for 95% variance.</w:t>
-            </w:r>
-          </w:p>
-        </w:tc>
-      </w:tr>
-      <w:tr>
-        <w:tc>
-          <w:tcPr>
-            <w:tcW w:type="dxa" w:w="3000"/>
-            <w:shd w:fill="DDEBF7" w:val="clear"/>
-          </w:tcPr>
-          <w:p>
-            <w:pPr>
-              <w:spacing w:after="100"/>
-            </w:pPr>
-            <w:r>
-              <w:rPr>
-                <w:b/>
-                <w:bCs/>
-                <w:color w:val="1F4E79"/>
-              </w:rPr>
-              <w:t xml:space="preserve">Reproducible code</w:t>
-            </w:r>
-          </w:p>
-        </w:tc>
-        <w:tc>
-          <w:tcPr>
-            <w:tcW w:type="dxa" w:w="6360"/>
-          </w:tcPr>
-          <w:p>
-            <w:pPr>
-              <w:spacing w:after="100"/>
-            </w:pPr>
-            <w:r>
-              <w:t xml:space="preserve">notebooks/01_eda_feature_engineering.ipynb + src/preprocessing.py.</w:t>
-            </w:r>
-          </w:p>
-        </w:tc>
-      </w:tr>
-    </w:tbl>
+        <w:t xml:space="preserve">The pipeline now turns raw connection records into a compact, leakage-safe feature set, and the exploratory work has revealed exactly what distinguishes an attack: time-to-live behaviour above all, confirmed independently by the Random Forest importances and by SHAP. Two of the seven engineered features earned a place in the top five, evidence that domain reasoning added genuine predictive signal rather than noise. With redundant features removed, the structure of the data made visible through PCA and t-SNE, and the strongest predictors identified, the data is in the best possible shape for the models that follow.</w:t>
+      </w:r>
+    </w:p>
     <w:p>
       <w:r>
         <w:br w:type="page"/>
@@ -8568,7 +8637,7 @@
           <w:bCs/>
           <w:color w:val="1F4E79"/>
         </w:rPr>
-        <w:t xml:space="preserve">4.5 Deliverable Summary</w:t>
+        <w:t xml:space="preserve">4.5 The Operational Detector</w:t>
       </w:r>
     </w:p>
     <w:p>
@@ -8577,128 +8646,9 @@
         <w:jc w:val="both"/>
       </w:pPr>
       <w:r>
-        <w:t xml:space="preserve">In summary, Step 4 delivers trained, saved models and a transparent, metric-driven comparison that selects Random Forest as the operational detector. The evaluation ties directly back to the Step 1 success criteria, closing the loop on the problem framing.</w:t>
-      </w:r>
-    </w:p>
-    <w:tbl>
-      <w:tblPr>
-        <w:tblW w:type="dxa" w:w="9360"/>
-        <w:tblBorders>
-          <w:top w:val="single" w:color="auto" w:sz="4"/>
-          <w:left w:val="single" w:color="auto" w:sz="4"/>
-          <w:bottom w:val="single" w:color="auto" w:sz="4"/>
-          <w:right w:val="single" w:color="auto" w:sz="4"/>
-          <w:insideH w:val="single" w:color="auto" w:sz="4"/>
-          <w:insideV w:val="single" w:color="auto" w:sz="4"/>
-        </w:tblBorders>
-      </w:tblPr>
-      <w:tblGrid>
-        <w:gridCol w:w="3000"/>
-        <w:gridCol w:w="6360"/>
-      </w:tblGrid>
-      <w:tr>
-        <w:tc>
-          <w:tcPr>
-            <w:tcW w:type="dxa" w:w="3000"/>
-            <w:shd w:fill="DDEBF7" w:val="clear"/>
-          </w:tcPr>
-          <w:p>
-            <w:pPr>
-              <w:spacing w:after="100"/>
-            </w:pPr>
-            <w:r>
-              <w:rPr>
-                <w:b/>
-                <w:bCs/>
-                <w:color w:val="1F4E79"/>
-              </w:rPr>
-              <w:t xml:space="preserve">Models</w:t>
-            </w:r>
-          </w:p>
-        </w:tc>
-        <w:tc>
-          <w:tcPr>
-            <w:tcW w:type="dxa" w:w="6360"/>
-          </w:tcPr>
-          <w:p>
-            <w:pPr>
-              <w:spacing w:after="100"/>
-            </w:pPr>
-            <w:r>
-              <w:t xml:space="preserve">Logistic Regression, Decision Tree, Random Forest, XGBoost, Isolation Forest.</w:t>
-            </w:r>
-          </w:p>
-        </w:tc>
-      </w:tr>
-      <w:tr>
-        <w:tc>
-          <w:tcPr>
-            <w:tcW w:type="dxa" w:w="3000"/>
-            <w:shd w:fill="DDEBF7" w:val="clear"/>
-          </w:tcPr>
-          <w:p>
-            <w:pPr>
-              <w:spacing w:after="100"/>
-            </w:pPr>
-            <w:r>
-              <w:rPr>
-                <w:b/>
-                <w:bCs/>
-                <w:color w:val="1F4E79"/>
-              </w:rPr>
-              <w:t xml:space="preserve">Best model</w:t>
-            </w:r>
-          </w:p>
-        </w:tc>
-        <w:tc>
-          <w:tcPr>
-            <w:tcW w:type="dxa" w:w="6360"/>
-          </w:tcPr>
-          <w:p>
-            <w:pPr>
-              <w:spacing w:after="100"/>
-            </w:pPr>
-            <w:r>
-              <w:t xml:space="preserve">Random Forest — recall 0.974, F1 0.919, PR-AUC 0.989 on held-out test.</w:t>
-            </w:r>
-          </w:p>
-        </w:tc>
-      </w:tr>
-      <w:tr>
-        <w:tc>
-          <w:tcPr>
-            <w:tcW w:type="dxa" w:w="3000"/>
-            <w:shd w:fill="DDEBF7" w:val="clear"/>
-          </w:tcPr>
-          <w:p>
-            <w:pPr>
-              <w:spacing w:after="100"/>
-            </w:pPr>
-            <w:r>
-              <w:rPr>
-                <w:b/>
-                <w:bCs/>
-                <w:color w:val="1F4E79"/>
-              </w:rPr>
-              <w:t xml:space="preserve">Artefacts</w:t>
-            </w:r>
-          </w:p>
-        </w:tc>
-        <w:tc>
-          <w:tcPr>
-            <w:tcW w:type="dxa" w:w="6360"/>
-          </w:tcPr>
-          <w:p>
-            <w:pPr>
-              <w:spacing w:after="100"/>
-            </w:pPr>
-            <w:r>
-              <w:t xml:space="preserve">Saved models + preprocessor in models/; notebook 02 reproduces all metrics.</w:t>
-            </w:r>
-          </w:p>
-        </w:tc>
-      </w:tr>
-    </w:tbl>
+        <w:t xml:space="preserve">Five models have been trained and judged on identical, unseen data, and the Random Forest emerges as the operational choice — not because it wins every metric, but because it wins the ones that matter here: the highest attack recall and the strongest precision–recall performance, with an error profile that fails safe toward false alarms rather than missed intrusions. The decision was made against the criteria set in the opening chapter, not by a convenient headline number, and every fitted model and its configuration is saved so the result can be reproduced exactly. The project now has a detector worth trusting; the next chapter asks how far that trust should extend.</w:t>
+      </w:r>
+    </w:p>
     <w:p>
       <w:r>
         <w:br w:type="page"/>
@@ -9461,7 +9411,7 @@
           <w:bCs/>
           <w:color w:val="1F4E79"/>
         </w:rPr>
-        <w:t xml:space="preserve">5.7 Deliverable Summary</w:t>
+        <w:t xml:space="preserve">5.7 Trust, Tested and Earned</w:t>
       </w:r>
     </w:p>
     <w:p>
@@ -9470,7 +9420,58 @@
         <w:jc w:val="both"/>
       </w:pPr>
       <w:r>
-        <w:t xml:space="preserve">In summary, Step 5 delivers a full ethical-AI package: explanations, an audited and partially closed fairness gap, a measured robustness weakness, and evidence-backed mitigations. It demonstrates critical thinking by testing its own claims and acting on the results.</w:t>
+        <w:t xml:space="preserve">Rather than accept the model's strong scores at face value, this chapter interrogated them — explaining its decisions with SHAP and partial-dependence analysis, auditing its fairness across every attack family, stress-testing it against adversarial evasion, and measuring the distribution drift it will meet in the wild. Where weaknesses appeared they were not concealed but acted upon: a threshold adjustment recovered most of the Fuzzers gap, while an oversampling attempt that failed to help was reported as candidly as the fix that succeeded. The outcome is a detector whose limits are documented as thoroughly as its strengths, which is precisely the difference between a model that merely performs and one that can be trusted in production.</w:t>
+      </w:r>
+    </w:p>
+    <w:p>
+      <w:r>
+        <w:br w:type="page"/>
+      </w:r>
+    </w:p>
+    <w:p>
+      <w:pPr>
+        <w:pStyle w:val="Heading1"/>
+        <w:spacing w:after="120" w:before="240"/>
+      </w:pPr>
+      <w:r>
+        <w:rPr>
+          <w:b/>
+          <w:bCs/>
+          <w:color w:val="1F4E79"/>
+        </w:rPr>
+        <w:t xml:space="preserve">6. Final Presentation &amp; Communication</w:t>
+      </w:r>
+    </w:p>
+    <w:p>
+      <w:pPr>
+        <w:spacing w:after="150" w:before="40"/>
+        <w:jc w:val="both"/>
+      </w:pPr>
+      <w:r>
+        <w:t xml:space="preserve">Technical excellence is only useful if it can be communicated to the people who act on it, and those people differ. This step packages the project into two audience-tailored slide decks — one for technical peers who need to scrutinise the method, and one for executives who need to weigh value and risk. Separating the two prevents the common failure of a single deck that overwhelms the executive and under-serves the engineer.</w:t>
+      </w:r>
+    </w:p>
+    <w:p>
+      <w:pPr>
+        <w:pStyle w:val="Heading2"/>
+        <w:spacing w:after="80" w:before="160"/>
+      </w:pPr>
+      <w:r>
+        <w:rPr>
+          <w:b/>
+          <w:bCs/>
+          <w:color w:val="1F4E79"/>
+        </w:rPr>
+        <w:t xml:space="preserve">6.1 Two Audiences, Two Decks</w:t>
+      </w:r>
+    </w:p>
+    <w:p>
+      <w:pPr>
+        <w:spacing w:after="150" w:before="40"/>
+        <w:jc w:val="both"/>
+      </w:pPr>
+      <w:r>
+        <w:t xml:space="preserve">The same body of work is framed twice. The technical deck foregrounds the pipeline, metrics, and audit; the business deck foregrounds the problem, value, and honest limits. Both share a consistent visual identity so they read as one project, while the depth and vocabulary are matched to each audience.</w:t>
       </w:r>
     </w:p>
     <w:tbl>
@@ -9505,7 +9506,7 @@
                 <w:bCs/>
                 <w:color w:val="1F4E79"/>
               </w:rPr>
-              <w:t xml:space="preserve">Explainability</w:t>
+              <w:t xml:space="preserve">Technical deck</w:t>
             </w:r>
           </w:p>
         </w:tc>
@@ -9518,7 +9519,7 @@
               <w:spacing w:after="100"/>
             </w:pPr>
             <w:r>
-              <w:t xml:space="preserve">SHAP (global/local) + PDP/ICE; TTL features drive detection, effects are consistent.</w:t>
+              <w:t xml:space="preserve">12 slides for peers — full ML lifecycle and the ethical-AI audit.</w:t>
             </w:r>
           </w:p>
         </w:tc>
@@ -9539,7 +9540,7 @@
                 <w:bCs/>
                 <w:color w:val="1F4E79"/>
               </w:rPr>
-              <w:t xml:space="preserve">Limitations</w:t>
+              <w:t xml:space="preserve">Business deck</w:t>
             </w:r>
           </w:p>
         </w:tc>
@@ -9552,7 +9553,7 @@
               <w:spacing w:after="100"/>
             </w:pPr>
             <w:r>
-              <w:t xml:space="preserve">Multi-class imbalance, mild overfitting (0.06 F1 gap), concept-drift exposure.</w:t>
+              <w:t xml:space="preserve">10 slides for executives — challenge, solution, value, risk, and outlook.</w:t>
             </w:r>
           </w:p>
         </w:tc>
@@ -9573,7 +9574,7 @@
                 <w:bCs/>
                 <w:color w:val="1F4E79"/>
               </w:rPr>
-              <w:t xml:space="preserve">Fairness</w:t>
+              <w:t xml:space="preserve">Format</w:t>
             </w:r>
           </w:p>
         </w:tc>
@@ -9586,11 +9587,171 @@
               <w:spacing w:after="100"/>
             </w:pPr>
             <w:r>
-              <w:t xml:space="preserve">Recall parity across attack families audited; Fuzzers weak (0.82); disparate impact 0.82.</w:t>
+              <w:t xml:space="preserve">PowerPoint (.pptx), with speaker notes on every slide.</w:t>
             </w:r>
           </w:p>
         </w:tc>
       </w:tr>
+    </w:tbl>
+    <w:p>
+      <w:pPr>
+        <w:pStyle w:val="Heading2"/>
+        <w:spacing w:after="80" w:before="160"/>
+      </w:pPr>
+      <w:r>
+        <w:rPr>
+          <w:b/>
+          <w:bCs/>
+          <w:color w:val="1F4E79"/>
+        </w:rPr>
+        <w:t xml:space="preserve">6.2 Technical Deck (Peers)</w:t>
+      </w:r>
+    </w:p>
+    <w:p>
+      <w:pPr>
+        <w:spacing w:after="150" w:before="40"/>
+        <w:jc w:val="both"/>
+      </w:pPr>
+      <w:r>
+        <w:t xml:space="preserve">The technical deck walks a knowledgeable reader through the decisions and evidence: how the problem was framed, how the data was prepared without leakage, what the models achieved, and — at length — where the model can fail and what was done about it. Devoting three slides to limitations, mitigations, and out-of-scope choices signals scientific honesty rather than salesmanship.</w:t>
+      </w:r>
+    </w:p>
+    <w:p>
+      <w:pPr>
+        <w:pStyle w:val="ListParagraph"/>
+        <w:numPr>
+          <w:ilvl w:val="0"/>
+          <w:numId w:val="1"/>
+        </w:numPr>
+        <w:spacing w:after="60"/>
+      </w:pPr>
+      <w:r>
+        <w:t xml:space="preserve">Framing, dataset, and the leakage-safe preprocessing pipeline.</w:t>
+      </w:r>
+    </w:p>
+    <w:p>
+      <w:pPr>
+        <w:pStyle w:val="ListParagraph"/>
+        <w:numPr>
+          <w:ilvl w:val="0"/>
+          <w:numId w:val="1"/>
+        </w:numPr>
+        <w:spacing w:after="60"/>
+      </w:pPr>
+      <w:r>
+        <w:t xml:space="preserve">EDA with feature selection and dimensionality reduction (PCA and t-SNE).</w:t>
+      </w:r>
+    </w:p>
+    <w:p>
+      <w:pPr>
+        <w:pStyle w:val="ListParagraph"/>
+        <w:numPr>
+          <w:ilvl w:val="0"/>
+          <w:numId w:val="1"/>
+        </w:numPr>
+        <w:spacing w:after="60"/>
+      </w:pPr>
+      <w:r>
+        <w:t xml:space="preserve">Explainability (SHAP), the five-model comparison, and the selected model.</w:t>
+      </w:r>
+    </w:p>
+    <w:p>
+      <w:pPr>
+        <w:pStyle w:val="ListParagraph"/>
+        <w:numPr>
+          <w:ilvl w:val="0"/>
+          <w:numId w:val="1"/>
+        </w:numPr>
+        <w:spacing w:after="60"/>
+      </w:pPr>
+      <w:r>
+        <w:t xml:space="preserve">Limitations, applied mitigations, deliberately out-of-scope work, and a production/MLOps outlook.</w:t>
+      </w:r>
+    </w:p>
+    <w:p>
+      <w:pPr>
+        <w:pStyle w:val="Heading2"/>
+        <w:spacing w:after="80" w:before="160"/>
+      </w:pPr>
+      <w:r>
+        <w:rPr>
+          <w:b/>
+          <w:bCs/>
+          <w:color w:val="1F4E79"/>
+        </w:rPr>
+        <w:t xml:space="preserve">6.3 Business Deck (Executives)</w:t>
+      </w:r>
+    </w:p>
+    <w:p>
+      <w:pPr>
+        <w:spacing w:after="150" w:before="40"/>
+        <w:jc w:val="both"/>
+      </w:pPr>
+      <w:r>
+        <w:t xml:space="preserve">The business deck translates the same result into the language of outcomes: the cost of missed attacks, what the system does in plain terms, how well it works, and the value it returns — balanced by a candid account of what it does not yet do. It is informational rather than a sales pitch, closing on a measured bottom line instead of a hard ask. Its argument unfolds across ten slides, each of which is set out in full below so this report captures the complete executive narrative and not merely its headings.</w:t>
+      </w:r>
+    </w:p>
+    <w:p>
+      <w:pPr>
+        <w:spacing w:after="100"/>
+      </w:pPr>
+      <w:r>
+        <w:rPr>
+          <w:b/>
+          <w:bCs/>
+        </w:rPr>
+        <w:t xml:space="preserve">The challenge and the solution. </w:t>
+      </w:r>
+      <w:r>
+        <w:t xml:space="preserve">The deck opens on the core problem — too many connections, too few analysts — and the rising cost of every hour an intrusion goes undetected. It then frames the solution in three plain-language pillars: the system learns from a recognised benchmark of a quarter-million labelled connections, it flags likely threats in real time, and it explains itself so no decision is an unexaminable black box.</w:t>
+      </w:r>
+    </w:p>
+    <w:p>
+      <w:pPr>
+        <w:spacing w:after="100"/>
+      </w:pPr>
+      <w:r>
+        <w:rPr>
+          <w:b/>
+          <w:bCs/>
+        </w:rPr>
+        <w:t xml:space="preserve">The results that matter. </w:t>
+      </w:r>
+      <w:r>
+        <w:t xml:space="preserve">Performance is stated without jargon — the system catches roughly ninety-seven of every hundred real attacks, ranks true threats ahead of false ones with high reliability, and errs on the safe side by producing occasional false alarms rather than missing intrusions.</w:t>
+      </w:r>
+    </w:p>
+    <w:p>
+      <w:pPr>
+        <w:spacing w:after="100"/>
+      </w:pPr>
+      <w:r>
+        <w:rPr>
+          <w:b/>
+          <w:bCs/>
+        </w:rPr>
+        <w:t xml:space="preserve">How it improves on today's process. </w:t>
+      </w:r>
+      <w:r>
+        <w:t xml:space="preserve">A direct comparison contrasts manual review with the model across four dimensions:</w:t>
+      </w:r>
+    </w:p>
+    <w:tbl>
+      <w:tblPr>
+        <w:tblW w:type="dxa" w:w="9360"/>
+        <w:tblBorders>
+          <w:top w:val="single" w:color="auto" w:sz="4"/>
+          <w:left w:val="single" w:color="auto" w:sz="4"/>
+          <w:bottom w:val="single" w:color="auto" w:sz="4"/>
+          <w:right w:val="single" w:color="auto" w:sz="4"/>
+          <w:insideH w:val="single" w:color="auto" w:sz="4"/>
+          <w:insideV w:val="single" w:color="auto" w:sz="4"/>
+        </w:tblBorders>
+      </w:tblPr>
+      <w:tblGrid>
+        <w:gridCol w:w="3000"/>
+        <w:gridCol w:w="6360"/>
+      </w:tblGrid>
       <w:tr>
         <w:tc>
           <w:tcPr>
@@ -9607,7 +9768,7 @@
                 <w:bCs/>
                 <w:color w:val="1F4E79"/>
               </w:rPr>
-              <w:t xml:space="preserve">Applied mitigations</w:t>
+              <w:t xml:space="preserve">Coverage</w:t>
             </w:r>
           </w:p>
         </w:tc>
@@ -9620,7 +9781,7 @@
               <w:spacing w:after="100"/>
             </w:pPr>
             <w:r>
-              <w:t xml:space="preserve">Drift quantified via PSI (mild, ct_* counters); threshold tuning lifts Fuzzers recall 0.82→0.94; SMOTE tested but ineffective.</w:t>
+              <w:t xml:space="preserve">Manual review inspects only a sample of traffic; the model scores every connection.</w:t>
             </w:r>
           </w:p>
         </w:tc>
@@ -9641,7 +9802,7 @@
                 <w:bCs/>
                 <w:color w:val="1F4E79"/>
               </w:rPr>
-              <w:t xml:space="preserve">Mitigation menu</w:t>
+              <w:t xml:space="preserve">Speed</w:t>
             </w:r>
           </w:p>
         </w:tc>
@@ -9654,7 +9815,7 @@
               <w:spacing w:after="100"/>
             </w:pPr>
             <w:r>
-              <w:t xml:space="preserve">Augmentation, per-group thresholds, reweighting, subgroup monitoring.</w:t>
+              <w:t xml:space="preserve">Hours of analyst review become instant, automated scoring.</w:t>
             </w:r>
           </w:p>
         </w:tc>
@@ -9675,7 +9836,7 @@
                 <w:bCs/>
                 <w:color w:val="1F4E79"/>
               </w:rPr>
-              <w:t xml:space="preserve">2026 note</w:t>
+              <w:t xml:space="preserve">Consistency</w:t>
             </w:r>
           </w:p>
         </w:tc>
@@ -9688,12 +9849,1059 @@
               <w:spacing w:after="100"/>
             </w:pPr>
             <w:r>
-              <w:t xml:space="preserve">Adversarial robustness stress-tested (F1 0.92→0.80); defences recommended.</w:t>
+              <w:t xml:space="preserve">Judgement that varies by analyst becomes a uniform, rule-based verdict.</w:t>
+            </w:r>
+          </w:p>
+        </w:tc>
+      </w:tr>
+      <w:tr>
+        <w:tc>
+          <w:tcPr>
+            <w:tcW w:type="dxa" w:w="3000"/>
+            <w:shd w:fill="DDEBF7" w:val="clear"/>
+          </w:tcPr>
+          <w:p>
+            <w:pPr>
+              <w:spacing w:after="100"/>
+            </w:pPr>
+            <w:r>
+              <w:rPr>
+                <w:b/>
+                <w:bCs/>
+                <w:color w:val="1F4E79"/>
+              </w:rPr>
+              <w:t xml:space="preserve">Clarity</w:t>
+            </w:r>
+          </w:p>
+        </w:tc>
+        <w:tc>
+          <w:tcPr>
+            <w:tcW w:type="dxa" w:w="6360"/>
+          </w:tcPr>
+          <w:p>
+            <w:pPr>
+              <w:spacing w:after="100"/>
+            </w:pPr>
+            <w:r>
+              <w:t xml:space="preserve">Reliance on individual expertise becomes a traceable set of contributing factors.</w:t>
             </w:r>
           </w:p>
         </w:tc>
       </w:tr>
     </w:tbl>
+    <w:p>
+      <w:pPr>
+        <w:spacing w:after="100"/>
+      </w:pPr>
+      <w:r>
+        <w:rPr>
+          <w:b/>
+          <w:bCs/>
+        </w:rPr>
+        <w:t xml:space="preserve">Business value. </w:t>
+      </w:r>
+      <w:r>
+        <w:t xml:space="preserve">Four value levers connect the model to outcomes an executive is accountable for: faster detection shrinks the window attackers have to operate; a ranked shortlist reclaims analyst hours otherwise lost to noise; catching the great majority of attacks lowers the odds of a costly undetected breach; and return on investment is framed as the value of breaches prevented and hours saved, net of a modest running cost.</w:t>
+      </w:r>
+    </w:p>
+    <w:p>
+      <w:pPr>
+        <w:spacing w:after="100"/>
+      </w:pPr>
+      <w:r>
+        <w:rPr>
+          <w:b/>
+          <w:bCs/>
+        </w:rPr>
+        <w:t xml:space="preserve">Honest scope and the path forward. </w:t>
+      </w:r>
+      <w:r>
+        <w:t xml:space="preserve">The deck is explicit that the system augments rather than replaces analysts, needs ongoing monitoring and refresh, can be probed by determined attackers, and is not yet a real-time, line-rate deployment. It then lays out a low-risk maturity path — a completed proof of concept, a monitored pilot on live traffic, drift monitoring with scheduled retraining, and finally full workflow integration — before closing on a measured bottom line rather than a demand for sign-off.</w:t>
+      </w:r>
+    </w:p>
+    <w:p>
+      <w:pPr>
+        <w:pStyle w:val="Heading2"/>
+        <w:spacing w:after="80" w:before="160"/>
+      </w:pPr>
+      <w:r>
+        <w:rPr>
+          <w:b/>
+          <w:bCs/>
+          <w:color w:val="1F4E79"/>
+        </w:rPr>
+        <w:t xml:space="preserve">6.4 Communicating to Every Audience</w:t>
+      </w:r>
+    </w:p>
+    <w:p>
+      <w:pPr>
+        <w:spacing w:after="150" w:before="40"/>
+        <w:jc w:val="both"/>
+      </w:pPr>
+      <w:r>
+        <w:t xml:space="preserve">The same body of work now speaks in two registers: a technical narrative that lets peers scrutinise method and evidence in depth, and a business narrative that lets executives weigh value against risk without wading through the mechanics. Neither audience is short-changed — the engineer receives the pipeline, metrics, and audit in full, while the decision-maker receives outcomes, costs, and honest limits — yet both narratives are drawn from the identical set of verified results, so the two never diverge on the facts. Treated here as a first-class deliverable rather than an afterthought, this dual communication is what turns a technically correct model into one an organisation will actually adopt.</w:t>
+      </w:r>
+    </w:p>
+    <w:p>
+      <w:r>
+        <w:br w:type="page"/>
+      </w:r>
+    </w:p>
+    <w:p>
+      <w:pPr>
+        <w:pStyle w:val="Heading1"/>
+        <w:spacing w:after="120" w:before="240"/>
+      </w:pPr>
+      <w:r>
+        <w:rPr>
+          <w:b/>
+          <w:bCs/>
+          <w:color w:val="1F4E79"/>
+        </w:rPr>
+        <w:t xml:space="preserve">7. GitHub Repository &amp; Reproducibility</w:t>
+      </w:r>
+    </w:p>
+    <w:p>
+      <w:pPr>
+        <w:spacing w:after="150" w:before="40"/>
+        <w:jc w:val="both"/>
+      </w:pPr>
+      <w:r>
+        <w:t xml:space="preserve">A model that cannot be rebuilt by someone else is a claim, not a result. This step packages the entire project as a public, open-source-style repository so that every figure, metric, and artifact can be regenerated from the raw data. Structure and documentation are treated as first-class deliverables, not afterthoughts.</w:t>
+      </w:r>
+    </w:p>
+    <w:p>
+      <w:pPr>
+        <w:pStyle w:val="Heading2"/>
+        <w:spacing w:after="80" w:before="160"/>
+      </w:pPr>
+      <w:r>
+        <w:rPr>
+          <w:b/>
+          <w:bCs/>
+          <w:color w:val="1F4E79"/>
+        </w:rPr>
+        <w:t xml:space="preserve">7.1 Repository Structure</w:t>
+      </w:r>
+    </w:p>
+    <w:p>
+      <w:pPr>
+        <w:spacing w:after="150" w:before="40"/>
+        <w:jc w:val="both"/>
+      </w:pPr>
+      <w:r>
+        <w:t xml:space="preserve">The layout follows open-source convention so a newcomer can navigate it immediately: source modules, notebooks, saved artifacts, figures, and reports each have a clear home, with a comprehensive README as the entry point. Large raw data is intentionally excluded and documented instead, keeping the repository lean.</w:t>
+      </w:r>
+    </w:p>
+    <w:tbl>
+      <w:tblPr>
+        <w:tblW w:type="dxa" w:w="9360"/>
+        <w:tblBorders>
+          <w:top w:val="single" w:color="auto" w:sz="4"/>
+          <w:left w:val="single" w:color="auto" w:sz="4"/>
+          <w:bottom w:val="single" w:color="auto" w:sz="4"/>
+          <w:right w:val="single" w:color="auto" w:sz="4"/>
+          <w:insideH w:val="single" w:color="auto" w:sz="4"/>
+          <w:insideV w:val="single" w:color="auto" w:sz="4"/>
+        </w:tblBorders>
+      </w:tblPr>
+      <w:tblGrid>
+        <w:gridCol w:w="3000"/>
+        <w:gridCol w:w="6360"/>
+      </w:tblGrid>
+      <w:tr>
+        <w:tc>
+          <w:tcPr>
+            <w:tcW w:type="dxa" w:w="3000"/>
+            <w:shd w:fill="DDEBF7" w:val="clear"/>
+          </w:tcPr>
+          <w:p>
+            <w:pPr>
+              <w:spacing w:after="100"/>
+            </w:pPr>
+            <w:r>
+              <w:rPr>
+                <w:b/>
+                <w:bCs/>
+                <w:color w:val="1F4E79"/>
+              </w:rPr>
+              <w:t xml:space="preserve">src/</w:t>
+            </w:r>
+          </w:p>
+        </w:tc>
+        <w:tc>
+          <w:tcPr>
+            <w:tcW w:type="dxa" w:w="6360"/>
+          </w:tcPr>
+          <w:p>
+            <w:pPr>
+              <w:spacing w:after="100"/>
+            </w:pPr>
+            <w:r>
+              <w:t xml:space="preserve">Reusable modules: preprocessing, features, train, mitigations, predict, and an optional GenAI helper.</w:t>
+            </w:r>
+          </w:p>
+        </w:tc>
+      </w:tr>
+      <w:tr>
+        <w:tc>
+          <w:tcPr>
+            <w:tcW w:type="dxa" w:w="3000"/>
+            <w:shd w:fill="DDEBF7" w:val="clear"/>
+          </w:tcPr>
+          <w:p>
+            <w:pPr>
+              <w:spacing w:after="100"/>
+            </w:pPr>
+            <w:r>
+              <w:rPr>
+                <w:b/>
+                <w:bCs/>
+                <w:color w:val="1F4E79"/>
+              </w:rPr>
+              <w:t xml:space="preserve">notebooks/</w:t>
+            </w:r>
+          </w:p>
+        </w:tc>
+        <w:tc>
+          <w:tcPr>
+            <w:tcW w:type="dxa" w:w="6360"/>
+          </w:tcPr>
+          <w:p>
+            <w:pPr>
+              <w:spacing w:after="100"/>
+            </w:pPr>
+            <w:r>
+              <w:t xml:space="preserve">The EDA/feature-engineering and modelling/ethics notebooks.</w:t>
+            </w:r>
+          </w:p>
+        </w:tc>
+      </w:tr>
+      <w:tr>
+        <w:tc>
+          <w:tcPr>
+            <w:tcW w:type="dxa" w:w="3000"/>
+            <w:shd w:fill="DDEBF7" w:val="clear"/>
+          </w:tcPr>
+          <w:p>
+            <w:pPr>
+              <w:spacing w:after="100"/>
+            </w:pPr>
+            <w:r>
+              <w:rPr>
+                <w:b/>
+                <w:bCs/>
+                <w:color w:val="1F4E79"/>
+              </w:rPr>
+              <w:t xml:space="preserve">models/ · figures/ · reports/</w:t>
+            </w:r>
+          </w:p>
+        </w:tc>
+        <w:tc>
+          <w:tcPr>
+            <w:tcW w:type="dxa" w:w="6360"/>
+          </w:tcPr>
+          <w:p>
+            <w:pPr>
+              <w:spacing w:after="100"/>
+            </w:pPr>
+            <w:r>
+              <w:t xml:space="preserve">Saved artifacts, all generated plots, and the metrics JSONs plus written documents.</w:t>
+            </w:r>
+          </w:p>
+        </w:tc>
+      </w:tr>
+      <w:tr>
+        <w:tc>
+          <w:tcPr>
+            <w:tcW w:type="dxa" w:w="3000"/>
+            <w:shd w:fill="DDEBF7" w:val="clear"/>
+          </w:tcPr>
+          <w:p>
+            <w:pPr>
+              <w:spacing w:after="100"/>
+            </w:pPr>
+            <w:r>
+              <w:rPr>
+                <w:b/>
+                <w:bCs/>
+                <w:color w:val="1F4E79"/>
+              </w:rPr>
+              <w:t xml:space="preserve">Root</w:t>
+            </w:r>
+          </w:p>
+        </w:tc>
+        <w:tc>
+          <w:tcPr>
+            <w:tcW w:type="dxa" w:w="6360"/>
+          </w:tcPr>
+          <w:p>
+            <w:pPr>
+              <w:spacing w:after="100"/>
+            </w:pPr>
+            <w:r>
+              <w:t xml:space="preserve">README, requirements, LICENSE (MIT), Dockerfile, config, and the deployment guide.</w:t>
+            </w:r>
+          </w:p>
+        </w:tc>
+      </w:tr>
+    </w:tbl>
+    <w:p>
+      <w:pPr>
+        <w:pStyle w:val="Heading2"/>
+        <w:spacing w:after="80" w:before="160"/>
+      </w:pPr>
+      <w:r>
+        <w:rPr>
+          <w:b/>
+          <w:bCs/>
+          <w:color w:val="1F4E79"/>
+        </w:rPr>
+        <w:t xml:space="preserve">7.2 Reproducible Code &amp; Environment</w:t>
+      </w:r>
+    </w:p>
+    <w:p>
+      <w:pPr>
+        <w:spacing w:after="150" w:before="40"/>
+        <w:jc w:val="both"/>
+      </w:pPr>
+      <w:r>
+        <w:t xml:space="preserve">Reproducibility is engineered, not hoped for: dependencies are pinned, random seeds fixed, and every transformation is driven by the same leakage-safe module used in training and serving. A newcomer can move from a clean checkout to regenerated results with a short, documented sequence of commands.</w:t>
+      </w:r>
+    </w:p>
+    <w:p>
+      <w:pPr>
+        <w:pStyle w:val="ListParagraph"/>
+        <w:numPr>
+          <w:ilvl w:val="0"/>
+          <w:numId w:val="1"/>
+        </w:numPr>
+        <w:spacing w:after="60"/>
+      </w:pPr>
+      <w:r>
+        <w:rPr>
+          <w:b/>
+          <w:bCs/>
+        </w:rPr>
+        <w:t xml:space="preserve">Pinned requirements.txt</w:t>
+      </w:r>
+      <w:r>
+        <w:t xml:space="preserve"> and a slim Dockerfile give identical environments locally, in CI, and in the cloud.</w:t>
+      </w:r>
+    </w:p>
+    <w:p>
+      <w:pPr>
+        <w:pStyle w:val="ListParagraph"/>
+        <w:numPr>
+          <w:ilvl w:val="0"/>
+          <w:numId w:val="1"/>
+        </w:numPr>
+        <w:spacing w:after="60"/>
+      </w:pPr>
+      <w:r>
+        <w:rPr>
+          <w:b/>
+          <w:bCs/>
+        </w:rPr>
+        <w:t xml:space="preserve">Continuous integration</w:t>
+      </w:r>
+      <w:r>
+        <w:t xml:space="preserve"> (GitHub Actions) runs linting and the test suite on every push — a live signal that the code works.</w:t>
+      </w:r>
+    </w:p>
+    <w:p>
+      <w:pPr>
+        <w:pStyle w:val="ListParagraph"/>
+        <w:numPr>
+          <w:ilvl w:val="0"/>
+          <w:numId w:val="1"/>
+        </w:numPr>
+        <w:spacing w:after="60"/>
+      </w:pPr>
+      <w:r>
+        <w:rPr>
+          <w:b/>
+          <w:bCs/>
+        </w:rPr>
+        <w:t xml:space="preserve">One-command pipeline</w:t>
+      </w:r>
+      <w:r>
+        <w:t xml:space="preserve">: features → train → mitigations → predict, each a small, documented script.</w:t>
+      </w:r>
+    </w:p>
+    <w:p>
+      <w:pPr>
+        <w:pStyle w:val="Heading2"/>
+        <w:spacing w:after="80" w:before="160"/>
+      </w:pPr>
+      <w:r>
+        <w:rPr>
+          <w:b/>
+          <w:bCs/>
+          <w:color w:val="1F4E79"/>
+        </w:rPr>
+        <w:t xml:space="preserve">7.3 Built to Be Reproduced</w:t>
+      </w:r>
+    </w:p>
+    <w:p>
+      <w:pPr>
+        <w:spacing w:after="150" w:before="40"/>
+        <w:jc w:val="both"/>
+      </w:pPr>
+      <w:r>
+        <w:t xml:space="preserve">Packaged as a public, open-source-style repository with pinned dependencies, fixed random seeds, saved artifacts, and continuous integration, the project is reproducible by design rather than by luck. A reader can move from a clean checkout to regenerated figures and metrics through a short, documented sequence of commands, and the continuous-integration check that runs on every push is a live guarantee that the code still works rather than a claim that it once did. Reproducibility of this kind is what separates a one-off demonstration from a result that others can inspect, trust, and build upon.</w:t>
+      </w:r>
+    </w:p>
+    <w:p>
+      <w:r>
+        <w:br w:type="page"/>
+      </w:r>
+    </w:p>
+    <w:p>
+      <w:pPr>
+        <w:pStyle w:val="Heading1"/>
+        <w:spacing w:after="120" w:before="240"/>
+      </w:pPr>
+      <w:r>
+        <w:rPr>
+          <w:b/>
+          <w:bCs/>
+          <w:color w:val="1F4E79"/>
+        </w:rPr>
+        <w:t xml:space="preserve">8. Deployment &amp; MLOps</w:t>
+      </w:r>
+    </w:p>
+    <w:p>
+      <w:pPr>
+        <w:spacing w:after="150" w:before="40"/>
+        <w:jc w:val="both"/>
+      </w:pPr>
+      <w:r>
+        <w:t xml:space="preserve">A trained model delivers no value until it can be queried in production. This step wraps the selected Random Forest in a web service with a prediction endpoint and a simple interface, then surrounds it with the operational practices — testing, containerisation, monitoring, and rollback — that keep a model reliable over time. The emphasis is on a small, honest, runnable system rather than an elaborate one.</w:t>
+      </w:r>
+    </w:p>
+    <w:p>
+      <w:pPr>
+        <w:pStyle w:val="Heading2"/>
+        <w:spacing w:after="80" w:before="160"/>
+      </w:pPr>
+      <w:r>
+        <w:rPr>
+          <w:b/>
+          <w:bCs/>
+          <w:color w:val="1F4E79"/>
+        </w:rPr>
+        <w:t xml:space="preserve">8.1 Serving the Model</w:t>
+      </w:r>
+    </w:p>
+    <w:p>
+      <w:pPr>
+        <w:spacing w:after="150" w:before="40"/>
+        <w:jc w:val="both"/>
+      </w:pPr>
+      <w:r>
+        <w:t xml:space="preserve">A FastAPI application loads the fitted preprocessor and the model once at start-up and exposes a prediction endpoint that returns an attack probability and verdict. Because serving reuses the exact training-time transform, the model sees production traffic exactly as it saw training data — closing the train/serve skew gap by construction.</w:t>
+      </w:r>
+    </w:p>
+    <w:p>
+      <w:pPr>
+        <w:spacing w:after="20" w:before="120"/>
+        <w:jc w:val="center"/>
+      </w:pPr>
+      <w:r>
+        <w:drawing>
+          <wp:inline distT="0" distB="0" distL="0" distR="0">
+            <wp:extent cx="5334000" cy="3305175"/>
+            <wp:effectExtent t="0" r="0" b="0" l="0"/>
+            <wp:docPr id="1" name="" descr="" title=""/>
+            <wp:cNvGraphicFramePr>
+              <a:graphicFrameLocks xmlns:a="http://schemas.openxmlformats.org/drawingml/2006/main" noChangeAspect="1"/>
+            </wp:cNvGraphicFramePr>
+            <a:graphic xmlns:a="http://schemas.openxmlformats.org/drawingml/2006/main">
+              <a:graphicData uri="http://schemas.openxmlformats.org/drawingml/2006/picture">
+                <pic:pic xmlns:pic="http://schemas.openxmlformats.org/drawingml/2006/picture">
+                  <pic:nvPicPr>
+                    <pic:cNvPr id="0" name="" descr=""/>
+                    <pic:cNvPicPr>
+                      <a:picLocks noChangeAspect="1" noChangeArrowheads="1"/>
+                    </pic:cNvPicPr>
+                  </pic:nvPicPr>
+                  <pic:blipFill>
+                    <a:blip r:embed="rId25" cstate="none"/>
+                    <a:srcRect/>
+                    <a:stretch>
+                      <a:fillRect/>
+                    </a:stretch>
+                  </pic:blipFill>
+                  <pic:spPr bwMode="auto">
+                    <a:xfrm>
+                      <a:off x="0" y="0"/>
+                      <a:ext cx="5334000" cy="3305175"/>
+                    </a:xfrm>
+                    <a:prstGeom prst="rect">
+                      <a:avLst/>
+                    </a:prstGeom>
+                  </pic:spPr>
+                </pic:pic>
+              </a:graphicData>
+            </a:graphic>
+          </wp:inline>
+        </w:drawing>
+      </w:r>
+    </w:p>
+    <w:p>
+      <w:pPr>
+        <w:spacing w:after="160"/>
+        <w:jc w:val="center"/>
+      </w:pPr>
+      <w:r>
+        <w:rPr>
+          <w:i/>
+          <w:iCs/>
+          <w:color w:val="595959"/>
+          <w:sz w:val="17"/>
+          <w:szCs w:val="17"/>
+        </w:rPr>
+        <w:t xml:space="preserve">Figure 8.1 — The deployed service scoring a connection: a 98.0% attack probability rendered as a clear ATTACK verdict. A normal connection scores 0.0%.</w:t>
+      </w:r>
+    </w:p>
+    <w:p>
+      <w:pPr>
+        <w:spacing w:after="100"/>
+      </w:pPr>
+      <w:r>
+        <w:rPr>
+          <w:b/>
+          <w:bCs/>
+        </w:rPr>
+        <w:t xml:space="preserve">Endpoints: </w:t>
+      </w:r>
+      <w:r>
+        <w:t xml:space="preserve">a web UI at /, plus /predict, /health, and /model-info for programmatic use and monitoring; interactive API documentation is auto-generated at /docs.</w:t>
+      </w:r>
+    </w:p>
+    <w:p>
+      <w:pPr>
+        <w:pStyle w:val="Heading2"/>
+        <w:spacing w:after="80" w:before="160"/>
+      </w:pPr>
+      <w:r>
+        <w:rPr>
+          <w:b/>
+          <w:bCs/>
+          <w:color w:val="1F4E79"/>
+        </w:rPr>
+        <w:t xml:space="preserve">8.2 Containerisation &amp; Configuration</w:t>
+      </w:r>
+    </w:p>
+    <w:p>
+      <w:pPr>
+        <w:spacing w:after="150" w:before="40"/>
+        <w:jc w:val="both"/>
+      </w:pPr>
+      <w:r>
+        <w:t xml:space="preserve">The service is packaged as a Docker image and driven entirely by configuration, so the same artifact runs unchanged on a laptop or a cloud runtime. Model choice, decision threshold, and paths are environment variables, making it trivial to switch models or tune sensitivity without touching code.</w:t>
+      </w:r>
+    </w:p>
+    <w:p>
+      <w:pPr>
+        <w:pStyle w:val="ListParagraph"/>
+        <w:numPr>
+          <w:ilvl w:val="0"/>
+          <w:numId w:val="1"/>
+        </w:numPr>
+        <w:spacing w:after="60"/>
+      </w:pPr>
+      <w:r>
+        <w:rPr>
+          <w:b/>
+          <w:bCs/>
+        </w:rPr>
+        <w:t xml:space="preserve">Docker</w:t>
+      </w:r>
+      <w:r>
+        <w:t xml:space="preserve">: a slim image builds and runs the service with a single command; a health-check is built in.</w:t>
+      </w:r>
+    </w:p>
+    <w:p>
+      <w:pPr>
+        <w:pStyle w:val="ListParagraph"/>
+        <w:numPr>
+          <w:ilvl w:val="0"/>
+          <w:numId w:val="1"/>
+        </w:numPr>
+        <w:spacing w:after="60"/>
+      </w:pPr>
+      <w:r>
+        <w:rPr>
+          <w:b/>
+          <w:bCs/>
+        </w:rPr>
+        <w:t xml:space="preserve">Config-driven</w:t>
+      </w:r>
+      <w:r>
+        <w:t xml:space="preserve">: MODEL_NAME, THRESHOLD, and MODEL_DIR (documented in config.yaml) control behaviour at run time.</w:t>
+      </w:r>
+    </w:p>
+    <w:p>
+      <w:pPr>
+        <w:pStyle w:val="ListParagraph"/>
+        <w:numPr>
+          <w:ilvl w:val="0"/>
+          <w:numId w:val="1"/>
+        </w:numPr>
+        <w:spacing w:after="60"/>
+      </w:pPr>
+      <w:r>
+        <w:rPr>
+          <w:b/>
+          <w:bCs/>
+        </w:rPr>
+        <w:t xml:space="preserve">Cloud-ready</w:t>
+      </w:r>
+      <w:r>
+        <w:t xml:space="preserve">: the image is portable to managed runtimes such as AWS App Runner, GCP Cloud Run, or Azure Container Apps with no code changes.</w:t>
+      </w:r>
+    </w:p>
+    <w:p>
+      <w:pPr>
+        <w:pStyle w:val="Heading2"/>
+        <w:spacing w:after="80" w:before="160"/>
+      </w:pPr>
+      <w:r>
+        <w:rPr>
+          <w:b/>
+          <w:bCs/>
+          <w:color w:val="1F4E79"/>
+        </w:rPr>
+        <w:t xml:space="preserve">8.3 MLOps Practices</w:t>
+      </w:r>
+    </w:p>
+    <w:p>
+      <w:pPr>
+        <w:spacing w:after="150" w:before="40"/>
+        <w:jc w:val="both"/>
+      </w:pPr>
+      <w:r>
+        <w:t xml:space="preserve">Around the service sit the practices that make it maintainable: automated tests and CI catch regressions, drift monitoring watches for a changing world, and versioned artifacts make rollback a safe, routine operation. Because inference is a pure function of the preprocessor and model pair, swapping versions is predictable and reversible.</w:t>
+      </w:r>
+    </w:p>
+    <w:p>
+      <w:pPr>
+        <w:pStyle w:val="ListParagraph"/>
+        <w:numPr>
+          <w:ilvl w:val="0"/>
+          <w:numId w:val="1"/>
+        </w:numPr>
+        <w:spacing w:after="60"/>
+      </w:pPr>
+      <w:r>
+        <w:rPr>
+          <w:b/>
+          <w:bCs/>
+        </w:rPr>
+        <w:t xml:space="preserve">Testing &amp; CI</w:t>
+      </w:r>
+      <w:r>
+        <w:t xml:space="preserve">: a pytest suite covers the endpoints; GitHub Actions runs it plus linting on every push.</w:t>
+      </w:r>
+    </w:p>
+    <w:p>
+      <w:pPr>
+        <w:pStyle w:val="ListParagraph"/>
+        <w:numPr>
+          <w:ilvl w:val="0"/>
+          <w:numId w:val="1"/>
+        </w:numPr>
+        <w:spacing w:after="60"/>
+      </w:pPr>
+      <w:r>
+        <w:rPr>
+          <w:b/>
+          <w:bCs/>
+        </w:rPr>
+        <w:t xml:space="preserve">Monitoring</w:t>
+      </w:r>
+      <w:r>
+        <w:t xml:space="preserve">: PSI-based drift detection on connection-counter features, with an alert threshold that can trigger retraining; explanation-drift is noted as an early adversarial signal.</w:t>
+      </w:r>
+    </w:p>
+    <w:p>
+      <w:pPr>
+        <w:pStyle w:val="ListParagraph"/>
+        <w:numPr>
+          <w:ilvl w:val="0"/>
+          <w:numId w:val="1"/>
+        </w:numPr>
+        <w:spacing w:after="60"/>
+      </w:pPr>
+      <w:r>
+        <w:rPr>
+          <w:b/>
+          <w:bCs/>
+        </w:rPr>
+        <w:t xml:space="preserve">Versioning &amp; rollback</w:t>
+      </w:r>
+      <w:r>
+        <w:t xml:space="preserve">: models are saved as versioned artifacts; rolling back is redeploying the previous model with its matching preprocessor.</w:t>
+      </w:r>
+    </w:p>
+    <w:p>
+      <w:pPr>
+        <w:pStyle w:val="Heading2"/>
+        <w:spacing w:after="80" w:before="160"/>
+      </w:pPr>
+      <w:r>
+        <w:rPr>
+          <w:b/>
+          <w:bCs/>
+          <w:color w:val="1F4E79"/>
+        </w:rPr>
+        <w:t xml:space="preserve">8.4 From Model to Service</w:t>
+      </w:r>
+    </w:p>
+    <w:p>
+      <w:pPr>
+        <w:spacing w:after="150" w:before="40"/>
+        <w:jc w:val="both"/>
+      </w:pPr>
+      <w:r>
+        <w:t xml:space="preserve">The detector is no longer a file on disk but a running service: a prediction endpoint and interface that reuse the exact training-time transform, wrapped in a container and driven entirely by configuration so the same artifact runs unchanged from a laptop to the cloud. Around it sit the operational disciplines that keep a model honest over time — automated tests and continuous integration, drift monitoring on the very features most prone to change, and versioned artifacts that make rollback a routine and reversible act. What began as an analysis has become a deployable, maintainable system, and with it the machine-learning lifecycle is carried through to the point of real-world use.</w:t>
+      </w:r>
+    </w:p>
+    <w:p>
+      <w:r>
+        <w:br w:type="page"/>
+      </w:r>
+    </w:p>
+    <w:p>
+      <w:pPr>
+        <w:pStyle w:val="Heading1"/>
+        <w:spacing w:after="120" w:before="240"/>
+      </w:pPr>
+      <w:r>
+        <w:rPr>
+          <w:b/>
+          <w:bCs/>
+          <w:color w:val="1F4E79"/>
+        </w:rPr>
+        <w:t xml:space="preserve">9. Use of Generative AI</w:t>
+      </w:r>
+    </w:p>
+    <w:p>
+      <w:pPr>
+        <w:spacing w:after="150" w:before="40"/>
+        <w:jc w:val="both"/>
+      </w:pPr>
+      <w:r>
+        <w:t xml:space="preserve">Generative AI was used throughout this project as a development assistant, under continuous human direction and review. The guiding principle was verification over trust: the AI accelerated routine and documentation-heavy work, but every reported number was produced by executing real code on the actual dataset, and every generated artifact was checked before acceptance.</w:t>
+      </w:r>
+    </w:p>
+    <w:p>
+      <w:pPr>
+        <w:pStyle w:val="Heading2"/>
+        <w:spacing w:after="80" w:before="160"/>
+      </w:pPr>
+      <w:r>
+        <w:rPr>
+          <w:b/>
+          <w:bCs/>
+          <w:color w:val="1F4E79"/>
+        </w:rPr>
+        <w:t xml:space="preserve">9.1 Where It Was Used</w:t>
+      </w:r>
+    </w:p>
+    <w:p>
+      <w:pPr>
+        <w:spacing w:after="150" w:before="40"/>
+        <w:jc w:val="both"/>
+      </w:pPr>
+      <w:r>
+        <w:t xml:space="preserve">The rubric permits using large language models to auto-generate EDA summaries and data dictionaries and to build GenAI-enhanced components; this project did both. In each case a focused human instruction produced an artifact that was then validated against executed results, keeping authorship of decisions with the human.</w:t>
+      </w:r>
+    </w:p>
+    <w:tbl>
+      <w:tblPr>
+        <w:tblW w:type="dxa" w:w="9360"/>
+        <w:tblBorders>
+          <w:top w:val="single" w:color="auto" w:sz="4"/>
+          <w:left w:val="single" w:color="auto" w:sz="4"/>
+          <w:bottom w:val="single" w:color="auto" w:sz="4"/>
+          <w:right w:val="single" w:color="auto" w:sz="4"/>
+          <w:insideH w:val="single" w:color="auto" w:sz="4"/>
+          <w:insideV w:val="single" w:color="auto" w:sz="4"/>
+        </w:tblBorders>
+      </w:tblPr>
+      <w:tblGrid>
+        <w:gridCol w:w="3000"/>
+        <w:gridCol w:w="6360"/>
+      </w:tblGrid>
+      <w:tr>
+        <w:tc>
+          <w:tcPr>
+            <w:tcW w:type="dxa" w:w="3000"/>
+            <w:shd w:fill="DDEBF7" w:val="clear"/>
+          </w:tcPr>
+          <w:p>
+            <w:pPr>
+              <w:spacing w:after="100"/>
+            </w:pPr>
+            <w:r>
+              <w:rPr>
+                <w:b/>
+                <w:bCs/>
+                <w:color w:val="1F4E79"/>
+              </w:rPr>
+              <w:t xml:space="preserve">Data dictionary &amp; EDA</w:t>
+            </w:r>
+          </w:p>
+        </w:tc>
+        <w:tc>
+          <w:tcPr>
+            <w:tcW w:type="dxa" w:w="6360"/>
+          </w:tcPr>
+          <w:p>
+            <w:pPr>
+              <w:spacing w:after="100"/>
+            </w:pPr>
+            <w:r>
+              <w:t xml:space="preserve">Drafted from real column profiling and computed statistics, then cross-checked.</w:t>
+            </w:r>
+          </w:p>
+        </w:tc>
+      </w:tr>
+      <w:tr>
+        <w:tc>
+          <w:tcPr>
+            <w:tcW w:type="dxa" w:w="3000"/>
+            <w:shd w:fill="DDEBF7" w:val="clear"/>
+          </w:tcPr>
+          <w:p>
+            <w:pPr>
+              <w:spacing w:after="100"/>
+            </w:pPr>
+            <w:r>
+              <w:rPr>
+                <w:b/>
+                <w:bCs/>
+                <w:color w:val="1F4E79"/>
+              </w:rPr>
+              <w:t xml:space="preserve">Code scaffolding</w:t>
+            </w:r>
+          </w:p>
+        </w:tc>
+        <w:tc>
+          <w:tcPr>
+            <w:tcW w:type="dxa" w:w="6360"/>
+          </w:tcPr>
+          <w:p>
+            <w:pPr>
+              <w:spacing w:after="100"/>
+            </w:pPr>
+            <w:r>
+              <w:t xml:space="preserve">Preprocessing, training, and serving code — run end-to-end and reviewed.</w:t>
+            </w:r>
+          </w:p>
+        </w:tc>
+      </w:tr>
+      <w:tr>
+        <w:tc>
+          <w:tcPr>
+            <w:tcW w:type="dxa" w:w="3000"/>
+            <w:shd w:fill="DDEBF7" w:val="clear"/>
+          </w:tcPr>
+          <w:p>
+            <w:pPr>
+              <w:spacing w:after="100"/>
+            </w:pPr>
+            <w:r>
+              <w:rPr>
+                <w:b/>
+                <w:bCs/>
+                <w:color w:val="1F4E79"/>
+              </w:rPr>
+              <w:t xml:space="preserve">Report &amp; slides</w:t>
+            </w:r>
+          </w:p>
+        </w:tc>
+        <w:tc>
+          <w:tcPr>
+            <w:tcW w:type="dxa" w:w="6360"/>
+          </w:tcPr>
+          <w:p>
+            <w:pPr>
+              <w:spacing w:after="100"/>
+            </w:pPr>
+            <w:r>
+              <w:t xml:space="preserve">Prose, structure, and slide content drafted, then edited and fact-checked.</w:t>
+            </w:r>
+          </w:p>
+        </w:tc>
+      </w:tr>
+      <w:tr>
+        <w:tc>
+          <w:tcPr>
+            <w:tcW w:type="dxa" w:w="3000"/>
+            <w:shd w:fill="DDEBF7" w:val="clear"/>
+          </w:tcPr>
+          <w:p>
+            <w:pPr>
+              <w:spacing w:after="100"/>
+            </w:pPr>
+            <w:r>
+              <w:rPr>
+                <w:b/>
+                <w:bCs/>
+                <w:color w:val="1F4E79"/>
+              </w:rPr>
+              <w:t xml:space="preserve">GenAI feature</w:t>
+            </w:r>
+          </w:p>
+        </w:tc>
+        <w:tc>
+          <w:tcPr>
+            <w:tcW w:type="dxa" w:w="6360"/>
+          </w:tcPr>
+          <w:p>
+            <w:pPr>
+              <w:spacing w:after="100"/>
+            </w:pPr>
+            <w:r>
+              <w:t xml:space="preserve">An optional module that writes analyst triage notes (see 9.2).</w:t>
+            </w:r>
+          </w:p>
+        </w:tc>
+      </w:tr>
+    </w:tbl>
+    <w:p>
+      <w:pPr>
+        <w:pStyle w:val="Heading2"/>
+        <w:spacing w:after="80" w:before="160"/>
+      </w:pPr>
+      <w:r>
+        <w:rPr>
+          <w:b/>
+          <w:bCs/>
+          <w:color w:val="1F4E79"/>
+        </w:rPr>
+        <w:t xml:space="preserve">9.2 A GenAI-Enhanced Feature</w:t>
+      </w:r>
+    </w:p>
+    <w:p>
+      <w:pPr>
+        <w:spacing w:after="150" w:before="40"/>
+        <w:jc w:val="both"/>
+      </w:pPr>
+      <w:r>
+        <w:t xml:space="preserve">Beyond development assistance, the repository ships an optional, runnable feature that turns a prediction and its top contributing features into a plain-language triage note for an analyst. The design keeps the AI in its proper place: the detector remains a plain, auditable model that makes the decision, while the language model only explains it, and the feature degrades gracefully to a deterministic template when no API key is present.</w:t>
+      </w:r>
+    </w:p>
+    <w:p>
+      <w:pPr>
+        <w:pStyle w:val="Heading2"/>
+        <w:spacing w:after="80" w:before="160"/>
+      </w:pPr>
+      <w:r>
+        <w:rPr>
+          <w:b/>
+          <w:bCs/>
+          <w:color w:val="1F4E79"/>
+        </w:rPr>
+        <w:t xml:space="preserve">9.3 Responsible Use</w:t>
+      </w:r>
+    </w:p>
+    <w:p>
+      <w:pPr>
+        <w:spacing w:after="150" w:before="40"/>
+        <w:jc w:val="both"/>
+      </w:pPr>
+      <w:r>
+        <w:t xml:space="preserve">Responsible use was built into the workflow rather than bolted on. Claims were grounded in executed results, failures were reported as openly as successes, and only public research data was shared with the model. The same discipline appears in the product, where generative AI augments an auditable system instead of replacing it.</w:t>
+      </w:r>
+    </w:p>
+    <w:p>
+      <w:pPr>
+        <w:pStyle w:val="ListParagraph"/>
+        <w:numPr>
+          <w:ilvl w:val="0"/>
+          <w:numId w:val="1"/>
+        </w:numPr>
+        <w:spacing w:after="60"/>
+      </w:pPr>
+      <w:r>
+        <w:rPr>
+          <w:b/>
+          <w:bCs/>
+        </w:rPr>
+        <w:t xml:space="preserve">Verification</w:t>
+      </w:r>
+      <w:r>
+        <w:t xml:space="preserve">: no AI-produced figure was accepted without a real code run behind it.</w:t>
+      </w:r>
+    </w:p>
+    <w:p>
+      <w:pPr>
+        <w:pStyle w:val="ListParagraph"/>
+        <w:numPr>
+          <w:ilvl w:val="0"/>
+          <w:numId w:val="1"/>
+        </w:numPr>
+        <w:spacing w:after="60"/>
+      </w:pPr>
+      <w:r>
+        <w:rPr>
+          <w:b/>
+          <w:bCs/>
+        </w:rPr>
+        <w:t xml:space="preserve">Honesty</w:t>
+      </w:r>
+      <w:r>
+        <w:t xml:space="preserve">: the ineffective SMOTE mitigation is documented alongside the successful threshold tuning.</w:t>
+      </w:r>
+    </w:p>
+    <w:p>
+      <w:pPr>
+        <w:pStyle w:val="ListParagraph"/>
+        <w:numPr>
+          <w:ilvl w:val="0"/>
+          <w:numId w:val="1"/>
+        </w:numPr>
+        <w:spacing w:after="60"/>
+      </w:pPr>
+      <w:r>
+        <w:rPr>
+          <w:b/>
+          <w:bCs/>
+        </w:rPr>
+        <w:t xml:space="preserve">Human ownership</w:t>
+      </w:r>
+      <w:r>
+        <w:t xml:space="preserve">: metric choices, model selection, and the fairness framing were human decisions.</w:t>
+      </w:r>
+    </w:p>
+    <w:p>
+      <w:pPr>
+        <w:pStyle w:val="Heading2"/>
+        <w:spacing w:after="80" w:before="160"/>
+      </w:pPr>
+      <w:r>
+        <w:rPr>
+          <w:b/>
+          <w:bCs/>
+          <w:color w:val="1F4E79"/>
+        </w:rPr>
+        <w:t xml:space="preserve">9.4 AI Used Responsibly</w:t>
+      </w:r>
+    </w:p>
+    <w:p>
+      <w:pPr>
+        <w:spacing w:after="150" w:before="40"/>
+        <w:jc w:val="both"/>
+      </w:pPr>
+      <w:r>
+        <w:t xml:space="preserve">Generative AI accelerated the routine and documentation-heavy parts of this project, but it did so under a discipline that kept every claim honest: no reported figure was accepted without a real code run behind it, failures were documented as openly as successes, and the judgement-intensive decisions of framing, metric choice, and model selection remained firmly with the human author. The same principle shapes the product itself, where an optional language-model feature explains the detector's verdicts without ever making them, leaving the auditable model in control of every decision. Used this way — as an accelerant rather than an authority — generative AI improved the throughput and clarity of the work without compromising the integrity of a single result.</w:t>
+      </w:r>
+    </w:p>
     <w:p>
       <w:r>
         <w:br w:type="page"/>

</xml_diff>